<commit_message>
HCM Interfaces 20250911 added commits
</commit_message>
<xml_diff>
--- a/GHR Interface Job Scheduler Setup.docx
+++ b/GHR Interface Job Scheduler Setup.docx
@@ -56,7 +56,7 @@
           <w:r>
             <w:fldChar w:fldCharType="separate"/>
           </w:r>
-          <w:hyperlink w:anchor="_Toc204349964" w:history="1">
+          <w:hyperlink w:anchor="_Toc207985082" w:history="1">
             <w:r>
               <w:rPr>
                 <w:rStyle w:val="Hyperlink"/>
@@ -83,7 +83,7 @@
                 <w:noProof/>
                 <w:webHidden/>
               </w:rPr>
-              <w:instrText xml:space="preserve"> PAGEREF _Toc204349964 \h </w:instrText>
+              <w:instrText xml:space="preserve"> PAGEREF _Toc207985082 \h </w:instrText>
             </w:r>
             <w:r>
               <w:rPr>
@@ -127,7 +127,7 @@
               <w:szCs w:val="24"/>
             </w:rPr>
           </w:pPr>
-          <w:hyperlink w:anchor="_Toc204349965" w:history="1">
+          <w:hyperlink w:anchor="_Toc207985083" w:history="1">
             <w:r>
               <w:rPr>
                 <w:rStyle w:val="Hyperlink"/>
@@ -154,7 +154,7 @@
                 <w:noProof/>
                 <w:webHidden/>
               </w:rPr>
-              <w:instrText xml:space="preserve"> PAGEREF _Toc204349965 \h </w:instrText>
+              <w:instrText xml:space="preserve"> PAGEREF _Toc207985083 \h </w:instrText>
             </w:r>
             <w:r>
               <w:rPr>
@@ -198,7 +198,7 @@
               <w:szCs w:val="24"/>
             </w:rPr>
           </w:pPr>
-          <w:hyperlink w:anchor="_Toc204349966" w:history="1">
+          <w:hyperlink w:anchor="_Toc207985084" w:history="1">
             <w:r>
               <w:rPr>
                 <w:rStyle w:val="Hyperlink"/>
@@ -225,7 +225,7 @@
                 <w:noProof/>
                 <w:webHidden/>
               </w:rPr>
-              <w:instrText xml:space="preserve"> PAGEREF _Toc204349966 \h </w:instrText>
+              <w:instrText xml:space="preserve"> PAGEREF _Toc207985084 \h </w:instrText>
             </w:r>
             <w:r>
               <w:rPr>
@@ -269,7 +269,7 @@
               <w:szCs w:val="24"/>
             </w:rPr>
           </w:pPr>
-          <w:hyperlink w:anchor="_Toc204349967" w:history="1">
+          <w:hyperlink w:anchor="_Toc207985085" w:history="1">
             <w:r>
               <w:rPr>
                 <w:rStyle w:val="Hyperlink"/>
@@ -296,7 +296,7 @@
                 <w:noProof/>
                 <w:webHidden/>
               </w:rPr>
-              <w:instrText xml:space="preserve"> PAGEREF _Toc204349967 \h </w:instrText>
+              <w:instrText xml:space="preserve"> PAGEREF _Toc207985085 \h </w:instrText>
             </w:r>
             <w:r>
               <w:rPr>
@@ -340,7 +340,7 @@
               <w:szCs w:val="24"/>
             </w:rPr>
           </w:pPr>
-          <w:hyperlink w:anchor="_Toc204349968" w:history="1">
+          <w:hyperlink w:anchor="_Toc207985086" w:history="1">
             <w:r>
               <w:rPr>
                 <w:rStyle w:val="Hyperlink"/>
@@ -367,7 +367,7 @@
                 <w:noProof/>
                 <w:webHidden/>
               </w:rPr>
-              <w:instrText xml:space="preserve"> PAGEREF _Toc204349968 \h </w:instrText>
+              <w:instrText xml:space="preserve"> PAGEREF _Toc207985086 \h </w:instrText>
             </w:r>
             <w:r>
               <w:rPr>
@@ -411,7 +411,7 @@
               <w:szCs w:val="24"/>
             </w:rPr>
           </w:pPr>
-          <w:hyperlink w:anchor="_Toc204349969" w:history="1">
+          <w:hyperlink w:anchor="_Toc207985087" w:history="1">
             <w:r>
               <w:rPr>
                 <w:rStyle w:val="Hyperlink"/>
@@ -438,7 +438,7 @@
                 <w:noProof/>
                 <w:webHidden/>
               </w:rPr>
-              <w:instrText xml:space="preserve"> PAGEREF _Toc204349969 \h </w:instrText>
+              <w:instrText xml:space="preserve"> PAGEREF _Toc207985087 \h </w:instrText>
             </w:r>
             <w:r>
               <w:rPr>
@@ -482,7 +482,7 @@
               <w:szCs w:val="24"/>
             </w:rPr>
           </w:pPr>
-          <w:hyperlink w:anchor="_Toc204349970" w:history="1">
+          <w:hyperlink w:anchor="_Toc207985088" w:history="1">
             <w:r>
               <w:rPr>
                 <w:rStyle w:val="Hyperlink"/>
@@ -509,7 +509,7 @@
                 <w:noProof/>
                 <w:webHidden/>
               </w:rPr>
-              <w:instrText xml:space="preserve"> PAGEREF _Toc204349970 \h </w:instrText>
+              <w:instrText xml:space="preserve"> PAGEREF _Toc207985088 \h </w:instrText>
             </w:r>
             <w:r>
               <w:rPr>
@@ -553,7 +553,7 @@
               <w:szCs w:val="24"/>
             </w:rPr>
           </w:pPr>
-          <w:hyperlink w:anchor="_Toc204349971" w:history="1">
+          <w:hyperlink w:anchor="_Toc207985089" w:history="1">
             <w:r>
               <w:rPr>
                 <w:rStyle w:val="Hyperlink"/>
@@ -580,7 +580,7 @@
                 <w:noProof/>
                 <w:webHidden/>
               </w:rPr>
-              <w:instrText xml:space="preserve"> PAGEREF _Toc204349971 \h </w:instrText>
+              <w:instrText xml:space="preserve"> PAGEREF _Toc207985089 \h </w:instrText>
             </w:r>
             <w:r>
               <w:rPr>
@@ -624,7 +624,7 @@
               <w:szCs w:val="24"/>
             </w:rPr>
           </w:pPr>
-          <w:hyperlink w:anchor="_Toc204349972" w:history="1">
+          <w:hyperlink w:anchor="_Toc207985090" w:history="1">
             <w:r>
               <w:rPr>
                 <w:rStyle w:val="Hyperlink"/>
@@ -651,7 +651,7 @@
                 <w:noProof/>
                 <w:webHidden/>
               </w:rPr>
-              <w:instrText xml:space="preserve"> PAGEREF _Toc204349972 \h </w:instrText>
+              <w:instrText xml:space="preserve"> PAGEREF _Toc207985090 \h </w:instrText>
             </w:r>
             <w:r>
               <w:rPr>
@@ -695,7 +695,7 @@
               <w:szCs w:val="24"/>
             </w:rPr>
           </w:pPr>
-          <w:hyperlink w:anchor="_Toc204349973" w:history="1">
+          <w:hyperlink w:anchor="_Toc207985091" w:history="1">
             <w:r>
               <w:rPr>
                 <w:rStyle w:val="Hyperlink"/>
@@ -722,7 +722,7 @@
                 <w:noProof/>
                 <w:webHidden/>
               </w:rPr>
-              <w:instrText xml:space="preserve"> PAGEREF _Toc204349973 \h </w:instrText>
+              <w:instrText xml:space="preserve"> PAGEREF _Toc207985091 \h </w:instrText>
             </w:r>
             <w:r>
               <w:rPr>
@@ -766,7 +766,7 @@
               <w:szCs w:val="24"/>
             </w:rPr>
           </w:pPr>
-          <w:hyperlink w:anchor="_Toc204349974" w:history="1">
+          <w:hyperlink w:anchor="_Toc207985092" w:history="1">
             <w:r>
               <w:rPr>
                 <w:rStyle w:val="Hyperlink"/>
@@ -793,7 +793,7 @@
                 <w:noProof/>
                 <w:webHidden/>
               </w:rPr>
-              <w:instrText xml:space="preserve"> PAGEREF _Toc204349974 \h </w:instrText>
+              <w:instrText xml:space="preserve"> PAGEREF _Toc207985092 \h </w:instrText>
             </w:r>
             <w:r>
               <w:rPr>
@@ -837,7 +837,7 @@
               <w:szCs w:val="24"/>
             </w:rPr>
           </w:pPr>
-          <w:hyperlink w:anchor="_Toc204349975" w:history="1">
+          <w:hyperlink w:anchor="_Toc207985093" w:history="1">
             <w:r>
               <w:rPr>
                 <w:rStyle w:val="Hyperlink"/>
@@ -864,7 +864,7 @@
                 <w:noProof/>
                 <w:webHidden/>
               </w:rPr>
-              <w:instrText xml:space="preserve"> PAGEREF _Toc204349975 \h </w:instrText>
+              <w:instrText xml:space="preserve"> PAGEREF _Toc207985093 \h </w:instrText>
             </w:r>
             <w:r>
               <w:rPr>
@@ -908,7 +908,7 @@
               <w:szCs w:val="24"/>
             </w:rPr>
           </w:pPr>
-          <w:hyperlink w:anchor="_Toc204349976" w:history="1">
+          <w:hyperlink w:anchor="_Toc207985094" w:history="1">
             <w:r>
               <w:rPr>
                 <w:rStyle w:val="Hyperlink"/>
@@ -935,7 +935,7 @@
                 <w:noProof/>
                 <w:webHidden/>
               </w:rPr>
-              <w:instrText xml:space="preserve"> PAGEREF _Toc204349976 \h </w:instrText>
+              <w:instrText xml:space="preserve"> PAGEREF _Toc207985094 \h </w:instrText>
             </w:r>
             <w:r>
               <w:rPr>
@@ -979,7 +979,7 @@
               <w:szCs w:val="24"/>
             </w:rPr>
           </w:pPr>
-          <w:hyperlink w:anchor="_Toc204349977" w:history="1">
+          <w:hyperlink w:anchor="_Toc207985095" w:history="1">
             <w:r>
               <w:rPr>
                 <w:rStyle w:val="Hyperlink"/>
@@ -1006,7 +1006,7 @@
                 <w:noProof/>
                 <w:webHidden/>
               </w:rPr>
-              <w:instrText xml:space="preserve"> PAGEREF _Toc204349977 \h </w:instrText>
+              <w:instrText xml:space="preserve"> PAGEREF _Toc207985095 \h </w:instrText>
             </w:r>
             <w:r>
               <w:rPr>
@@ -1050,7 +1050,7 @@
               <w:szCs w:val="24"/>
             </w:rPr>
           </w:pPr>
-          <w:hyperlink w:anchor="_Toc204349978" w:history="1">
+          <w:hyperlink w:anchor="_Toc207985096" w:history="1">
             <w:r>
               <w:rPr>
                 <w:rStyle w:val="Hyperlink"/>
@@ -1077,7 +1077,7 @@
                 <w:noProof/>
                 <w:webHidden/>
               </w:rPr>
-              <w:instrText xml:space="preserve"> PAGEREF _Toc204349978 \h </w:instrText>
+              <w:instrText xml:space="preserve"> PAGEREF _Toc207985096 \h </w:instrText>
             </w:r>
             <w:r>
               <w:rPr>
@@ -1121,7 +1121,7 @@
               <w:szCs w:val="24"/>
             </w:rPr>
           </w:pPr>
-          <w:hyperlink w:anchor="_Toc204349979" w:history="1">
+          <w:hyperlink w:anchor="_Toc207985097" w:history="1">
             <w:r>
               <w:rPr>
                 <w:rStyle w:val="Hyperlink"/>
@@ -1148,7 +1148,7 @@
                 <w:noProof/>
                 <w:webHidden/>
               </w:rPr>
-              <w:instrText xml:space="preserve"> PAGEREF _Toc204349979 \h </w:instrText>
+              <w:instrText xml:space="preserve"> PAGEREF _Toc207985097 \h </w:instrText>
             </w:r>
             <w:r>
               <w:rPr>
@@ -1192,7 +1192,7 @@
               <w:szCs w:val="24"/>
             </w:rPr>
           </w:pPr>
-          <w:hyperlink w:anchor="_Toc204349980" w:history="1">
+          <w:hyperlink w:anchor="_Toc207985098" w:history="1">
             <w:r>
               <w:rPr>
                 <w:rStyle w:val="Hyperlink"/>
@@ -1219,7 +1219,7 @@
                 <w:noProof/>
                 <w:webHidden/>
               </w:rPr>
-              <w:instrText xml:space="preserve"> PAGEREF _Toc204349980 \h </w:instrText>
+              <w:instrText xml:space="preserve"> PAGEREF _Toc207985098 \h </w:instrText>
             </w:r>
             <w:r>
               <w:rPr>
@@ -1263,7 +1263,7 @@
               <w:szCs w:val="24"/>
             </w:rPr>
           </w:pPr>
-          <w:hyperlink w:anchor="_Toc204349981" w:history="1">
+          <w:hyperlink w:anchor="_Toc207985099" w:history="1">
             <w:r>
               <w:rPr>
                 <w:rStyle w:val="Hyperlink"/>
@@ -1290,7 +1290,7 @@
                 <w:noProof/>
                 <w:webHidden/>
               </w:rPr>
-              <w:instrText xml:space="preserve"> PAGEREF _Toc204349981 \h </w:instrText>
+              <w:instrText xml:space="preserve"> PAGEREF _Toc207985099 \h </w:instrText>
             </w:r>
             <w:r>
               <w:rPr>
@@ -1334,7 +1334,7 @@
               <w:szCs w:val="24"/>
             </w:rPr>
           </w:pPr>
-          <w:hyperlink w:anchor="_Toc204349982" w:history="1">
+          <w:hyperlink w:anchor="_Toc207985100" w:history="1">
             <w:r>
               <w:rPr>
                 <w:rStyle w:val="Hyperlink"/>
@@ -1361,7 +1361,7 @@
                 <w:noProof/>
                 <w:webHidden/>
               </w:rPr>
-              <w:instrText xml:space="preserve"> PAGEREF _Toc204349982 \h </w:instrText>
+              <w:instrText xml:space="preserve"> PAGEREF _Toc207985100 \h </w:instrText>
             </w:r>
             <w:r>
               <w:rPr>
@@ -1405,7 +1405,7 @@
               <w:szCs w:val="24"/>
             </w:rPr>
           </w:pPr>
-          <w:hyperlink w:anchor="_Toc204349983" w:history="1">
+          <w:hyperlink w:anchor="_Toc207985101" w:history="1">
             <w:r>
               <w:rPr>
                 <w:rStyle w:val="Hyperlink"/>
@@ -1432,7 +1432,7 @@
                 <w:noProof/>
                 <w:webHidden/>
               </w:rPr>
-              <w:instrText xml:space="preserve"> PAGEREF _Toc204349983 \h </w:instrText>
+              <w:instrText xml:space="preserve"> PAGEREF _Toc207985101 \h </w:instrText>
             </w:r>
             <w:r>
               <w:rPr>
@@ -1476,7 +1476,7 @@
               <w:szCs w:val="24"/>
             </w:rPr>
           </w:pPr>
-          <w:hyperlink w:anchor="_Toc204349984" w:history="1">
+          <w:hyperlink w:anchor="_Toc207985102" w:history="1">
             <w:r>
               <w:rPr>
                 <w:rStyle w:val="Hyperlink"/>
@@ -1503,7 +1503,7 @@
                 <w:noProof/>
                 <w:webHidden/>
               </w:rPr>
-              <w:instrText xml:space="preserve"> PAGEREF _Toc204349984 \h </w:instrText>
+              <w:instrText xml:space="preserve"> PAGEREF _Toc207985102 \h </w:instrText>
             </w:r>
             <w:r>
               <w:rPr>
@@ -1547,7 +1547,7 @@
               <w:szCs w:val="24"/>
             </w:rPr>
           </w:pPr>
-          <w:hyperlink w:anchor="_Toc204349985" w:history="1">
+          <w:hyperlink w:anchor="_Toc207985103" w:history="1">
             <w:r>
               <w:rPr>
                 <w:rStyle w:val="Hyperlink"/>
@@ -1574,7 +1574,7 @@
                 <w:noProof/>
                 <w:webHidden/>
               </w:rPr>
-              <w:instrText xml:space="preserve"> PAGEREF _Toc204349985 \h </w:instrText>
+              <w:instrText xml:space="preserve"> PAGEREF _Toc207985103 \h </w:instrText>
             </w:r>
             <w:r>
               <w:rPr>
@@ -1618,7 +1618,7 @@
               <w:szCs w:val="24"/>
             </w:rPr>
           </w:pPr>
-          <w:hyperlink w:anchor="_Toc204349986" w:history="1">
+          <w:hyperlink w:anchor="_Toc207985104" w:history="1">
             <w:r>
               <w:rPr>
                 <w:rStyle w:val="Hyperlink"/>
@@ -1645,7 +1645,7 @@
                 <w:noProof/>
                 <w:webHidden/>
               </w:rPr>
-              <w:instrText xml:space="preserve"> PAGEREF _Toc204349986 \h </w:instrText>
+              <w:instrText xml:space="preserve"> PAGEREF _Toc207985104 \h </w:instrText>
             </w:r>
             <w:r>
               <w:rPr>
@@ -1689,13 +1689,27 @@
               <w:szCs w:val="24"/>
             </w:rPr>
           </w:pPr>
-          <w:hyperlink w:anchor="_Toc204349987" w:history="1">
+          <w:hyperlink w:anchor="_Toc207985105" w:history="1">
             <w:r>
               <w:rPr>
                 <w:rStyle w:val="Hyperlink"/>
                 <w:noProof/>
               </w:rPr>
-              <w:t>GHR INTERFACES</w:t>
+              <w:t>GHR INTER</w:t>
+            </w:r>
+            <w:r>
+              <w:rPr>
+                <w:rStyle w:val="Hyperlink"/>
+                <w:noProof/>
+              </w:rPr>
+              <w:t>F</w:t>
+            </w:r>
+            <w:r>
+              <w:rPr>
+                <w:rStyle w:val="Hyperlink"/>
+                <w:noProof/>
+              </w:rPr>
+              <w:t>ACES</w:t>
             </w:r>
             <w:r>
               <w:rPr>
@@ -1716,7 +1730,7 @@
                 <w:noProof/>
                 <w:webHidden/>
               </w:rPr>
-              <w:instrText xml:space="preserve"> PAGEREF _Toc204349987 \h </w:instrText>
+              <w:instrText xml:space="preserve"> PAGEREF _Toc207985105 \h </w:instrText>
             </w:r>
             <w:r>
               <w:rPr>
@@ -1760,7 +1774,7 @@
               <w:szCs w:val="24"/>
             </w:rPr>
           </w:pPr>
-          <w:hyperlink w:anchor="_Toc204349988" w:history="1">
+          <w:hyperlink w:anchor="_Toc207985106" w:history="1">
             <w:r>
               <w:rPr>
                 <w:rStyle w:val="Hyperlink"/>
@@ -1787,7 +1801,7 @@
                 <w:noProof/>
                 <w:webHidden/>
               </w:rPr>
-              <w:instrText xml:space="preserve"> PAGEREF _Toc204349988 \h </w:instrText>
+              <w:instrText xml:space="preserve"> PAGEREF _Toc207985106 \h </w:instrText>
             </w:r>
             <w:r>
               <w:rPr>
@@ -1831,7 +1845,7 @@
               <w:szCs w:val="24"/>
             </w:rPr>
           </w:pPr>
-          <w:hyperlink w:anchor="_Toc204349989" w:history="1">
+          <w:hyperlink w:anchor="_Toc207985107" w:history="1">
             <w:r>
               <w:rPr>
                 <w:rStyle w:val="Hyperlink"/>
@@ -1858,7 +1872,7 @@
                 <w:noProof/>
                 <w:webHidden/>
               </w:rPr>
-              <w:instrText xml:space="preserve"> PAGEREF _Toc204349989 \h </w:instrText>
+              <w:instrText xml:space="preserve"> PAGEREF _Toc207985107 \h </w:instrText>
             </w:r>
             <w:r>
               <w:rPr>
@@ -1902,7 +1916,7 @@
               <w:szCs w:val="24"/>
             </w:rPr>
           </w:pPr>
-          <w:hyperlink w:anchor="_Toc204349990" w:history="1">
+          <w:hyperlink w:anchor="_Toc207985108" w:history="1">
             <w:r>
               <w:rPr>
                 <w:rStyle w:val="Hyperlink"/>
@@ -1929,7 +1943,7 @@
                 <w:noProof/>
                 <w:webHidden/>
               </w:rPr>
-              <w:instrText xml:space="preserve"> PAGEREF _Toc204349990 \h </w:instrText>
+              <w:instrText xml:space="preserve"> PAGEREF _Toc207985108 \h </w:instrText>
             </w:r>
             <w:r>
               <w:rPr>
@@ -1973,7 +1987,7 @@
               <w:szCs w:val="24"/>
             </w:rPr>
           </w:pPr>
-          <w:hyperlink w:anchor="_Toc204349991" w:history="1">
+          <w:hyperlink w:anchor="_Toc207985109" w:history="1">
             <w:r>
               <w:rPr>
                 <w:rStyle w:val="Hyperlink"/>
@@ -2000,7 +2014,7 @@
                 <w:noProof/>
                 <w:webHidden/>
               </w:rPr>
-              <w:instrText xml:space="preserve"> PAGEREF _Toc204349991 \h </w:instrText>
+              <w:instrText xml:space="preserve"> PAGEREF _Toc207985109 \h </w:instrText>
             </w:r>
             <w:r>
               <w:rPr>
@@ -2020,7 +2034,619 @@
                 <w:noProof/>
                 <w:webHidden/>
               </w:rPr>
-              <w:t>18</w:t>
+              <w:t>19</w:t>
+            </w:r>
+            <w:r>
+              <w:rPr>
+                <w:noProof/>
+                <w:webHidden/>
+              </w:rPr>
+              <w:fldChar w:fldCharType="end"/>
+            </w:r>
+          </w:hyperlink>
+        </w:p>
+        <w:p>
+          <w:pPr>
+            <w:pStyle w:val="TOC3"/>
+            <w:tabs>
+              <w:tab w:val="right" w:leader="dot" w:pos="9350"/>
+            </w:tabs>
+            <w:rPr>
+              <w:noProof/>
+            </w:rPr>
+          </w:pPr>
+          <w:hyperlink w:anchor="_Toc207985110" w:history="1">
+            <w:r>
+              <w:rPr>
+                <w:rStyle w:val="Hyperlink"/>
+                <w:noProof/>
+              </w:rPr>
+              <w:t>New Hire</w:t>
+            </w:r>
+            <w:r>
+              <w:rPr>
+                <w:noProof/>
+                <w:webHidden/>
+              </w:rPr>
+              <w:tab/>
+            </w:r>
+            <w:r>
+              <w:rPr>
+                <w:noProof/>
+                <w:webHidden/>
+              </w:rPr>
+              <w:fldChar w:fldCharType="begin"/>
+            </w:r>
+            <w:r>
+              <w:rPr>
+                <w:noProof/>
+                <w:webHidden/>
+              </w:rPr>
+              <w:instrText xml:space="preserve"> PAGEREF _Toc207985110 \h </w:instrText>
+            </w:r>
+            <w:r>
+              <w:rPr>
+                <w:noProof/>
+                <w:webHidden/>
+              </w:rPr>
+            </w:r>
+            <w:r>
+              <w:rPr>
+                <w:noProof/>
+                <w:webHidden/>
+              </w:rPr>
+              <w:fldChar w:fldCharType="separate"/>
+            </w:r>
+            <w:r>
+              <w:rPr>
+                <w:noProof/>
+                <w:webHidden/>
+              </w:rPr>
+              <w:t>20</w:t>
+            </w:r>
+            <w:r>
+              <w:rPr>
+                <w:noProof/>
+                <w:webHidden/>
+              </w:rPr>
+              <w:fldChar w:fldCharType="end"/>
+            </w:r>
+          </w:hyperlink>
+        </w:p>
+        <w:p>
+          <w:pPr>
+            <w:pStyle w:val="TOC3"/>
+            <w:tabs>
+              <w:tab w:val="right" w:leader="dot" w:pos="9350"/>
+            </w:tabs>
+            <w:rPr>
+              <w:noProof/>
+            </w:rPr>
+          </w:pPr>
+          <w:hyperlink w:anchor="_Toc207985111" w:history="1">
+            <w:r>
+              <w:rPr>
+                <w:rStyle w:val="Hyperlink"/>
+                <w:noProof/>
+              </w:rPr>
+              <w:t>Salary Change</w:t>
+            </w:r>
+            <w:r>
+              <w:rPr>
+                <w:noProof/>
+                <w:webHidden/>
+              </w:rPr>
+              <w:tab/>
+            </w:r>
+            <w:r>
+              <w:rPr>
+                <w:noProof/>
+                <w:webHidden/>
+              </w:rPr>
+              <w:fldChar w:fldCharType="begin"/>
+            </w:r>
+            <w:r>
+              <w:rPr>
+                <w:noProof/>
+                <w:webHidden/>
+              </w:rPr>
+              <w:instrText xml:space="preserve"> PAGEREF _Toc207985111 \h </w:instrText>
+            </w:r>
+            <w:r>
+              <w:rPr>
+                <w:noProof/>
+                <w:webHidden/>
+              </w:rPr>
+            </w:r>
+            <w:r>
+              <w:rPr>
+                <w:noProof/>
+                <w:webHidden/>
+              </w:rPr>
+              <w:fldChar w:fldCharType="separate"/>
+            </w:r>
+            <w:r>
+              <w:rPr>
+                <w:noProof/>
+                <w:webHidden/>
+              </w:rPr>
+              <w:t>21</w:t>
+            </w:r>
+            <w:r>
+              <w:rPr>
+                <w:noProof/>
+                <w:webHidden/>
+              </w:rPr>
+              <w:fldChar w:fldCharType="end"/>
+            </w:r>
+          </w:hyperlink>
+        </w:p>
+        <w:p>
+          <w:pPr>
+            <w:pStyle w:val="TOC3"/>
+            <w:tabs>
+              <w:tab w:val="right" w:leader="dot" w:pos="9350"/>
+            </w:tabs>
+            <w:rPr>
+              <w:noProof/>
+            </w:rPr>
+          </w:pPr>
+          <w:hyperlink w:anchor="_Toc207985112" w:history="1">
+            <w:r>
+              <w:rPr>
+                <w:rStyle w:val="Hyperlink"/>
+                <w:noProof/>
+              </w:rPr>
+              <w:t>Transfer</w:t>
+            </w:r>
+            <w:r>
+              <w:rPr>
+                <w:noProof/>
+                <w:webHidden/>
+              </w:rPr>
+              <w:tab/>
+            </w:r>
+            <w:r>
+              <w:rPr>
+                <w:noProof/>
+                <w:webHidden/>
+              </w:rPr>
+              <w:fldChar w:fldCharType="begin"/>
+            </w:r>
+            <w:r>
+              <w:rPr>
+                <w:noProof/>
+                <w:webHidden/>
+              </w:rPr>
+              <w:instrText xml:space="preserve"> PAGEREF _Toc207985112 \h </w:instrText>
+            </w:r>
+            <w:r>
+              <w:rPr>
+                <w:noProof/>
+                <w:webHidden/>
+              </w:rPr>
+            </w:r>
+            <w:r>
+              <w:rPr>
+                <w:noProof/>
+                <w:webHidden/>
+              </w:rPr>
+              <w:fldChar w:fldCharType="separate"/>
+            </w:r>
+            <w:r>
+              <w:rPr>
+                <w:noProof/>
+                <w:webHidden/>
+              </w:rPr>
+              <w:t>22</w:t>
+            </w:r>
+            <w:r>
+              <w:rPr>
+                <w:noProof/>
+                <w:webHidden/>
+              </w:rPr>
+              <w:fldChar w:fldCharType="end"/>
+            </w:r>
+          </w:hyperlink>
+        </w:p>
+        <w:p>
+          <w:pPr>
+            <w:pStyle w:val="TOC3"/>
+            <w:tabs>
+              <w:tab w:val="right" w:leader="dot" w:pos="9350"/>
+            </w:tabs>
+            <w:rPr>
+              <w:noProof/>
+            </w:rPr>
+          </w:pPr>
+          <w:hyperlink w:anchor="_Toc207985113" w:history="1">
+            <w:r>
+              <w:rPr>
+                <w:rStyle w:val="Hyperlink"/>
+                <w:noProof/>
+              </w:rPr>
+              <w:t>Name Change</w:t>
+            </w:r>
+            <w:r>
+              <w:rPr>
+                <w:noProof/>
+                <w:webHidden/>
+              </w:rPr>
+              <w:tab/>
+            </w:r>
+            <w:r>
+              <w:rPr>
+                <w:noProof/>
+                <w:webHidden/>
+              </w:rPr>
+              <w:fldChar w:fldCharType="begin"/>
+            </w:r>
+            <w:r>
+              <w:rPr>
+                <w:noProof/>
+                <w:webHidden/>
+              </w:rPr>
+              <w:instrText xml:space="preserve"> PAGEREF _Toc207985113 \h </w:instrText>
+            </w:r>
+            <w:r>
+              <w:rPr>
+                <w:noProof/>
+                <w:webHidden/>
+              </w:rPr>
+            </w:r>
+            <w:r>
+              <w:rPr>
+                <w:noProof/>
+                <w:webHidden/>
+              </w:rPr>
+              <w:fldChar w:fldCharType="separate"/>
+            </w:r>
+            <w:r>
+              <w:rPr>
+                <w:noProof/>
+                <w:webHidden/>
+              </w:rPr>
+              <w:t>23</w:t>
+            </w:r>
+            <w:r>
+              <w:rPr>
+                <w:noProof/>
+                <w:webHidden/>
+              </w:rPr>
+              <w:fldChar w:fldCharType="end"/>
+            </w:r>
+          </w:hyperlink>
+        </w:p>
+        <w:p>
+          <w:pPr>
+            <w:pStyle w:val="TOC3"/>
+            <w:tabs>
+              <w:tab w:val="right" w:leader="dot" w:pos="9350"/>
+            </w:tabs>
+            <w:rPr>
+              <w:noProof/>
+            </w:rPr>
+          </w:pPr>
+          <w:hyperlink w:anchor="_Toc207985114" w:history="1">
+            <w:r>
+              <w:rPr>
+                <w:rStyle w:val="Hyperlink"/>
+                <w:noProof/>
+              </w:rPr>
+              <w:t>Status Change</w:t>
+            </w:r>
+            <w:r>
+              <w:rPr>
+                <w:noProof/>
+                <w:webHidden/>
+              </w:rPr>
+              <w:tab/>
+            </w:r>
+            <w:r>
+              <w:rPr>
+                <w:noProof/>
+                <w:webHidden/>
+              </w:rPr>
+              <w:fldChar w:fldCharType="begin"/>
+            </w:r>
+            <w:r>
+              <w:rPr>
+                <w:noProof/>
+                <w:webHidden/>
+              </w:rPr>
+              <w:instrText xml:space="preserve"> PAGEREF _Toc207985114 \h </w:instrText>
+            </w:r>
+            <w:r>
+              <w:rPr>
+                <w:noProof/>
+                <w:webHidden/>
+              </w:rPr>
+            </w:r>
+            <w:r>
+              <w:rPr>
+                <w:noProof/>
+                <w:webHidden/>
+              </w:rPr>
+              <w:fldChar w:fldCharType="separate"/>
+            </w:r>
+            <w:r>
+              <w:rPr>
+                <w:noProof/>
+                <w:webHidden/>
+              </w:rPr>
+              <w:t>23</w:t>
+            </w:r>
+            <w:r>
+              <w:rPr>
+                <w:noProof/>
+                <w:webHidden/>
+              </w:rPr>
+              <w:fldChar w:fldCharType="end"/>
+            </w:r>
+          </w:hyperlink>
+        </w:p>
+        <w:p>
+          <w:pPr>
+            <w:pStyle w:val="TOC3"/>
+            <w:tabs>
+              <w:tab w:val="right" w:leader="dot" w:pos="9350"/>
+            </w:tabs>
+            <w:rPr>
+              <w:noProof/>
+            </w:rPr>
+          </w:pPr>
+          <w:hyperlink w:anchor="_Toc207985115" w:history="1">
+            <w:r>
+              <w:rPr>
+                <w:rStyle w:val="Hyperlink"/>
+                <w:noProof/>
+              </w:rPr>
+              <w:t>Pay Allowances</w:t>
+            </w:r>
+            <w:r>
+              <w:rPr>
+                <w:noProof/>
+                <w:webHidden/>
+              </w:rPr>
+              <w:tab/>
+            </w:r>
+            <w:r>
+              <w:rPr>
+                <w:noProof/>
+                <w:webHidden/>
+              </w:rPr>
+              <w:fldChar w:fldCharType="begin"/>
+            </w:r>
+            <w:r>
+              <w:rPr>
+                <w:noProof/>
+                <w:webHidden/>
+              </w:rPr>
+              <w:instrText xml:space="preserve"> PAGEREF _Toc207985115 \h </w:instrText>
+            </w:r>
+            <w:r>
+              <w:rPr>
+                <w:noProof/>
+                <w:webHidden/>
+              </w:rPr>
+            </w:r>
+            <w:r>
+              <w:rPr>
+                <w:noProof/>
+                <w:webHidden/>
+              </w:rPr>
+              <w:fldChar w:fldCharType="separate"/>
+            </w:r>
+            <w:r>
+              <w:rPr>
+                <w:noProof/>
+                <w:webHidden/>
+              </w:rPr>
+              <w:t>24</w:t>
+            </w:r>
+            <w:r>
+              <w:rPr>
+                <w:noProof/>
+                <w:webHidden/>
+              </w:rPr>
+              <w:fldChar w:fldCharType="end"/>
+            </w:r>
+          </w:hyperlink>
+        </w:p>
+        <w:p>
+          <w:pPr>
+            <w:pStyle w:val="TOC3"/>
+            <w:tabs>
+              <w:tab w:val="right" w:leader="dot" w:pos="9350"/>
+            </w:tabs>
+            <w:rPr>
+              <w:noProof/>
+            </w:rPr>
+          </w:pPr>
+          <w:hyperlink w:anchor="_Toc207985116" w:history="1">
+            <w:r>
+              <w:rPr>
+                <w:rStyle w:val="Hyperlink"/>
+                <w:noProof/>
+              </w:rPr>
+              <w:t>Update Pay Group</w:t>
+            </w:r>
+            <w:r>
+              <w:rPr>
+                <w:noProof/>
+                <w:webHidden/>
+              </w:rPr>
+              <w:tab/>
+            </w:r>
+            <w:r>
+              <w:rPr>
+                <w:noProof/>
+                <w:webHidden/>
+              </w:rPr>
+              <w:fldChar w:fldCharType="begin"/>
+            </w:r>
+            <w:r>
+              <w:rPr>
+                <w:noProof/>
+                <w:webHidden/>
+              </w:rPr>
+              <w:instrText xml:space="preserve"> PAGEREF _Toc207985116 \h </w:instrText>
+            </w:r>
+            <w:r>
+              <w:rPr>
+                <w:noProof/>
+                <w:webHidden/>
+              </w:rPr>
+            </w:r>
+            <w:r>
+              <w:rPr>
+                <w:noProof/>
+                <w:webHidden/>
+              </w:rPr>
+              <w:fldChar w:fldCharType="separate"/>
+            </w:r>
+            <w:r>
+              <w:rPr>
+                <w:noProof/>
+                <w:webHidden/>
+              </w:rPr>
+              <w:t>25</w:t>
+            </w:r>
+            <w:r>
+              <w:rPr>
+                <w:noProof/>
+                <w:webHidden/>
+              </w:rPr>
+              <w:fldChar w:fldCharType="end"/>
+            </w:r>
+          </w:hyperlink>
+        </w:p>
+        <w:p>
+          <w:pPr>
+            <w:pStyle w:val="TOC3"/>
+            <w:tabs>
+              <w:tab w:val="right" w:leader="dot" w:pos="9350"/>
+            </w:tabs>
+            <w:rPr>
+              <w:noProof/>
+            </w:rPr>
+          </w:pPr>
+          <w:hyperlink w:anchor="_Toc207985117" w:history="1">
+            <w:r>
+              <w:rPr>
+                <w:rStyle w:val="Hyperlink"/>
+                <w:noProof/>
+              </w:rPr>
+              <w:t>Update Labor Group</w:t>
+            </w:r>
+            <w:r>
+              <w:rPr>
+                <w:noProof/>
+                <w:webHidden/>
+              </w:rPr>
+              <w:tab/>
+            </w:r>
+            <w:r>
+              <w:rPr>
+                <w:noProof/>
+                <w:webHidden/>
+              </w:rPr>
+              <w:fldChar w:fldCharType="begin"/>
+            </w:r>
+            <w:r>
+              <w:rPr>
+                <w:noProof/>
+                <w:webHidden/>
+              </w:rPr>
+              <w:instrText xml:space="preserve"> PAGEREF _Toc207985117 \h </w:instrText>
+            </w:r>
+            <w:r>
+              <w:rPr>
+                <w:noProof/>
+                <w:webHidden/>
+              </w:rPr>
+            </w:r>
+            <w:r>
+              <w:rPr>
+                <w:noProof/>
+                <w:webHidden/>
+              </w:rPr>
+              <w:fldChar w:fldCharType="separate"/>
+            </w:r>
+            <w:r>
+              <w:rPr>
+                <w:noProof/>
+                <w:webHidden/>
+              </w:rPr>
+              <w:t>26</w:t>
+            </w:r>
+            <w:r>
+              <w:rPr>
+                <w:noProof/>
+                <w:webHidden/>
+              </w:rPr>
+              <w:fldChar w:fldCharType="end"/>
+            </w:r>
+          </w:hyperlink>
+        </w:p>
+        <w:p>
+          <w:pPr>
+            <w:pStyle w:val="TOC3"/>
+            <w:tabs>
+              <w:tab w:val="right" w:leader="dot" w:pos="9350"/>
+            </w:tabs>
+            <w:rPr>
+              <w:noProof/>
+            </w:rPr>
+          </w:pPr>
+          <w:hyperlink w:anchor="_Toc207985118" w:history="1">
+            <w:r>
+              <w:rPr>
+                <w:rStyle w:val="Hyperlink"/>
+                <w:noProof/>
+              </w:rPr>
+              <w:t>Update Position Title</w:t>
+            </w:r>
+            <w:r>
+              <w:rPr>
+                <w:noProof/>
+                <w:webHidden/>
+              </w:rPr>
+              <w:tab/>
+            </w:r>
+            <w:r>
+              <w:rPr>
+                <w:noProof/>
+                <w:webHidden/>
+              </w:rPr>
+              <w:fldChar w:fldCharType="begin"/>
+            </w:r>
+            <w:r>
+              <w:rPr>
+                <w:noProof/>
+                <w:webHidden/>
+              </w:rPr>
+              <w:instrText xml:space="preserve"> PAGEREF _Toc207985118 \h </w:instrText>
+            </w:r>
+            <w:r>
+              <w:rPr>
+                <w:noProof/>
+                <w:webHidden/>
+              </w:rPr>
+            </w:r>
+            <w:r>
+              <w:rPr>
+                <w:noProof/>
+                <w:webHidden/>
+              </w:rPr>
+              <w:fldChar w:fldCharType="separate"/>
+            </w:r>
+            <w:r>
+              <w:rPr>
+                <w:noProof/>
+                <w:webHidden/>
+              </w:rPr>
+              <w:t>26</w:t>
             </w:r>
             <w:r>
               <w:rPr>
@@ -2044,7 +2670,7 @@
               <w:szCs w:val="24"/>
             </w:rPr>
           </w:pPr>
-          <w:hyperlink w:anchor="_Toc204349992" w:history="1">
+          <w:hyperlink w:anchor="_Toc207985119" w:history="1">
             <w:r>
               <w:rPr>
                 <w:rStyle w:val="Hyperlink"/>
@@ -2071,7 +2697,7 @@
                 <w:noProof/>
                 <w:webHidden/>
               </w:rPr>
-              <w:instrText xml:space="preserve"> PAGEREF _Toc204349992 \h </w:instrText>
+              <w:instrText xml:space="preserve"> PAGEREF _Toc207985119 \h </w:instrText>
             </w:r>
             <w:r>
               <w:rPr>
@@ -2091,7 +2717,7 @@
                 <w:noProof/>
                 <w:webHidden/>
               </w:rPr>
-              <w:t>23</w:t>
+              <w:t>27</w:t>
             </w:r>
             <w:r>
               <w:rPr>
@@ -2115,7 +2741,7 @@
               <w:szCs w:val="24"/>
             </w:rPr>
           </w:pPr>
-          <w:hyperlink w:anchor="_Toc204349993" w:history="1">
+          <w:hyperlink w:anchor="_Toc207985120" w:history="1">
             <w:r>
               <w:rPr>
                 <w:rStyle w:val="Hyperlink"/>
@@ -2142,7 +2768,7 @@
                 <w:noProof/>
                 <w:webHidden/>
               </w:rPr>
-              <w:instrText xml:space="preserve"> PAGEREF _Toc204349993 \h </w:instrText>
+              <w:instrText xml:space="preserve"> PAGEREF _Toc207985120 \h </w:instrText>
             </w:r>
             <w:r>
               <w:rPr>
@@ -2162,7 +2788,7 @@
                 <w:noProof/>
                 <w:webHidden/>
               </w:rPr>
-              <w:t>23</w:t>
+              <w:t>28</w:t>
             </w:r>
             <w:r>
               <w:rPr>
@@ -2186,7 +2812,7 @@
               <w:szCs w:val="24"/>
             </w:rPr>
           </w:pPr>
-          <w:hyperlink w:anchor="_Toc204349994" w:history="1">
+          <w:hyperlink w:anchor="_Toc207985121" w:history="1">
             <w:r>
               <w:rPr>
                 <w:rStyle w:val="Hyperlink"/>
@@ -2213,7 +2839,7 @@
                 <w:noProof/>
                 <w:webHidden/>
               </w:rPr>
-              <w:instrText xml:space="preserve"> PAGEREF _Toc204349994 \h </w:instrText>
+              <w:instrText xml:space="preserve"> PAGEREF _Toc207985121 \h </w:instrText>
             </w:r>
             <w:r>
               <w:rPr>
@@ -2233,7 +2859,7 @@
                 <w:noProof/>
                 <w:webHidden/>
               </w:rPr>
-              <w:t>24</w:t>
+              <w:t>29</w:t>
             </w:r>
             <w:r>
               <w:rPr>
@@ -2257,7 +2883,7 @@
               <w:szCs w:val="24"/>
             </w:rPr>
           </w:pPr>
-          <w:hyperlink w:anchor="_Toc204349995" w:history="1">
+          <w:hyperlink w:anchor="_Toc207985122" w:history="1">
             <w:r>
               <w:rPr>
                 <w:rStyle w:val="Hyperlink"/>
@@ -2284,7 +2910,7 @@
                 <w:noProof/>
                 <w:webHidden/>
               </w:rPr>
-              <w:instrText xml:space="preserve"> PAGEREF _Toc204349995 \h </w:instrText>
+              <w:instrText xml:space="preserve"> PAGEREF _Toc207985122 \h </w:instrText>
             </w:r>
             <w:r>
               <w:rPr>
@@ -2304,7 +2930,7 @@
                 <w:noProof/>
                 <w:webHidden/>
               </w:rPr>
-              <w:t>24</w:t>
+              <w:t>29</w:t>
             </w:r>
             <w:r>
               <w:rPr>
@@ -2328,7 +2954,7 @@
               <w:szCs w:val="24"/>
             </w:rPr>
           </w:pPr>
-          <w:hyperlink w:anchor="_Toc204349996" w:history="1">
+          <w:hyperlink w:anchor="_Toc207985123" w:history="1">
             <w:r>
               <w:rPr>
                 <w:rStyle w:val="Hyperlink"/>
@@ -2355,7 +2981,7 @@
                 <w:noProof/>
                 <w:webHidden/>
               </w:rPr>
-              <w:instrText xml:space="preserve"> PAGEREF _Toc204349996 \h </w:instrText>
+              <w:instrText xml:space="preserve"> PAGEREF _Toc207985123 \h </w:instrText>
             </w:r>
             <w:r>
               <w:rPr>
@@ -2375,7 +3001,7 @@
                 <w:noProof/>
                 <w:webHidden/>
               </w:rPr>
-              <w:t>25</w:t>
+              <w:t>30</w:t>
             </w:r>
             <w:r>
               <w:rPr>
@@ -2399,7 +3025,7 @@
               <w:szCs w:val="24"/>
             </w:rPr>
           </w:pPr>
-          <w:hyperlink w:anchor="_Toc204349997" w:history="1">
+          <w:hyperlink w:anchor="_Toc207985124" w:history="1">
             <w:r>
               <w:rPr>
                 <w:rStyle w:val="Hyperlink"/>
@@ -2426,7 +3052,7 @@
                 <w:noProof/>
                 <w:webHidden/>
               </w:rPr>
-              <w:instrText xml:space="preserve"> PAGEREF _Toc204349997 \h </w:instrText>
+              <w:instrText xml:space="preserve"> PAGEREF _Toc207985124 \h </w:instrText>
             </w:r>
             <w:r>
               <w:rPr>
@@ -2446,7 +3072,7 @@
                 <w:noProof/>
                 <w:webHidden/>
               </w:rPr>
-              <w:t>26</w:t>
+              <w:t>31</w:t>
             </w:r>
             <w:r>
               <w:rPr>
@@ -2470,7 +3096,7 @@
               <w:szCs w:val="24"/>
             </w:rPr>
           </w:pPr>
-          <w:hyperlink w:anchor="_Toc204349998" w:history="1">
+          <w:hyperlink w:anchor="_Toc207985125" w:history="1">
             <w:r>
               <w:rPr>
                 <w:rStyle w:val="Hyperlink"/>
@@ -2497,7 +3123,7 @@
                 <w:noProof/>
                 <w:webHidden/>
               </w:rPr>
-              <w:instrText xml:space="preserve"> PAGEREF _Toc204349998 \h </w:instrText>
+              <w:instrText xml:space="preserve"> PAGEREF _Toc207985125 \h </w:instrText>
             </w:r>
             <w:r>
               <w:rPr>
@@ -2517,7 +3143,7 @@
                 <w:noProof/>
                 <w:webHidden/>
               </w:rPr>
-              <w:t>27</w:t>
+              <w:t>32</w:t>
             </w:r>
             <w:r>
               <w:rPr>
@@ -2541,7 +3167,7 @@
               <w:szCs w:val="24"/>
             </w:rPr>
           </w:pPr>
-          <w:hyperlink w:anchor="_Toc204349999" w:history="1">
+          <w:hyperlink w:anchor="_Toc207985126" w:history="1">
             <w:r>
               <w:rPr>
                 <w:rStyle w:val="Hyperlink"/>
@@ -2568,7 +3194,7 @@
                 <w:noProof/>
                 <w:webHidden/>
               </w:rPr>
-              <w:instrText xml:space="preserve"> PAGEREF _Toc204349999 \h </w:instrText>
+              <w:instrText xml:space="preserve"> PAGEREF _Toc207985126 \h </w:instrText>
             </w:r>
             <w:r>
               <w:rPr>
@@ -2588,7 +3214,7 @@
                 <w:noProof/>
                 <w:webHidden/>
               </w:rPr>
-              <w:t>28</w:t>
+              <w:t>33</w:t>
             </w:r>
             <w:r>
               <w:rPr>
@@ -2612,7 +3238,7 @@
               <w:szCs w:val="24"/>
             </w:rPr>
           </w:pPr>
-          <w:hyperlink w:anchor="_Toc204350000" w:history="1">
+          <w:hyperlink w:anchor="_Toc207985127" w:history="1">
             <w:r>
               <w:rPr>
                 <w:rStyle w:val="Hyperlink"/>
@@ -2639,7 +3265,7 @@
                 <w:noProof/>
                 <w:webHidden/>
               </w:rPr>
-              <w:instrText xml:space="preserve"> PAGEREF _Toc204350000 \h </w:instrText>
+              <w:instrText xml:space="preserve"> PAGEREF _Toc207985127 \h </w:instrText>
             </w:r>
             <w:r>
               <w:rPr>
@@ -2659,7 +3285,7 @@
                 <w:noProof/>
                 <w:webHidden/>
               </w:rPr>
-              <w:t>28</w:t>
+              <w:t>33</w:t>
             </w:r>
             <w:r>
               <w:rPr>
@@ -2683,7 +3309,7 @@
               <w:szCs w:val="24"/>
             </w:rPr>
           </w:pPr>
-          <w:hyperlink w:anchor="_Toc204350001" w:history="1">
+          <w:hyperlink w:anchor="_Toc207985128" w:history="1">
             <w:r>
               <w:rPr>
                 <w:rStyle w:val="Hyperlink"/>
@@ -2710,7 +3336,7 @@
                 <w:noProof/>
                 <w:webHidden/>
               </w:rPr>
-              <w:instrText xml:space="preserve"> PAGEREF _Toc204350001 \h </w:instrText>
+              <w:instrText xml:space="preserve"> PAGEREF _Toc207985128 \h </w:instrText>
             </w:r>
             <w:r>
               <w:rPr>
@@ -2730,7 +3356,7 @@
                 <w:noProof/>
                 <w:webHidden/>
               </w:rPr>
-              <w:t>29</w:t>
+              <w:t>34</w:t>
             </w:r>
             <w:r>
               <w:rPr>
@@ -2754,7 +3380,7 @@
               <w:szCs w:val="24"/>
             </w:rPr>
           </w:pPr>
-          <w:hyperlink w:anchor="_Toc204350002" w:history="1">
+          <w:hyperlink w:anchor="_Toc207985129" w:history="1">
             <w:r>
               <w:rPr>
                 <w:rStyle w:val="Hyperlink"/>
@@ -2781,7 +3407,7 @@
                 <w:noProof/>
                 <w:webHidden/>
               </w:rPr>
-              <w:instrText xml:space="preserve"> PAGEREF _Toc204350002 \h </w:instrText>
+              <w:instrText xml:space="preserve"> PAGEREF _Toc207985129 \h </w:instrText>
             </w:r>
             <w:r>
               <w:rPr>
@@ -2801,7 +3427,7 @@
                 <w:noProof/>
                 <w:webHidden/>
               </w:rPr>
-              <w:t>29</w:t>
+              <w:t>34</w:t>
             </w:r>
             <w:r>
               <w:rPr>
@@ -2825,7 +3451,7 @@
               <w:szCs w:val="24"/>
             </w:rPr>
           </w:pPr>
-          <w:hyperlink w:anchor="_Toc204350003" w:history="1">
+          <w:hyperlink w:anchor="_Toc207985130" w:history="1">
             <w:r>
               <w:rPr>
                 <w:rStyle w:val="Hyperlink"/>
@@ -2852,7 +3478,7 @@
                 <w:noProof/>
                 <w:webHidden/>
               </w:rPr>
-              <w:instrText xml:space="preserve"> PAGEREF _Toc204350003 \h </w:instrText>
+              <w:instrText xml:space="preserve"> PAGEREF _Toc207985130 \h </w:instrText>
             </w:r>
             <w:r>
               <w:rPr>
@@ -2872,7 +3498,7 @@
                 <w:noProof/>
                 <w:webHidden/>
               </w:rPr>
-              <w:t>30</w:t>
+              <w:t>35</w:t>
             </w:r>
             <w:r>
               <w:rPr>
@@ -2896,7 +3522,7 @@
               <w:szCs w:val="24"/>
             </w:rPr>
           </w:pPr>
-          <w:hyperlink w:anchor="_Toc204350004" w:history="1">
+          <w:hyperlink w:anchor="_Toc207985131" w:history="1">
             <w:r>
               <w:rPr>
                 <w:rStyle w:val="Hyperlink"/>
@@ -2923,7 +3549,7 @@
                 <w:noProof/>
                 <w:webHidden/>
               </w:rPr>
-              <w:instrText xml:space="preserve"> PAGEREF _Toc204350004 \h </w:instrText>
+              <w:instrText xml:space="preserve"> PAGEREF _Toc207985131 \h </w:instrText>
             </w:r>
             <w:r>
               <w:rPr>
@@ -2943,7 +3569,7 @@
                 <w:noProof/>
                 <w:webHidden/>
               </w:rPr>
-              <w:t>30</w:t>
+              <w:t>35</w:t>
             </w:r>
             <w:r>
               <w:rPr>
@@ -2967,7 +3593,7 @@
               <w:szCs w:val="24"/>
             </w:rPr>
           </w:pPr>
-          <w:hyperlink w:anchor="_Toc204350005" w:history="1">
+          <w:hyperlink w:anchor="_Toc207985132" w:history="1">
             <w:r>
               <w:rPr>
                 <w:rStyle w:val="Hyperlink"/>
@@ -2994,7 +3620,7 @@
                 <w:noProof/>
                 <w:webHidden/>
               </w:rPr>
-              <w:instrText xml:space="preserve"> PAGEREF _Toc204350005 \h </w:instrText>
+              <w:instrText xml:space="preserve"> PAGEREF _Toc207985132 \h </w:instrText>
             </w:r>
             <w:r>
               <w:rPr>
@@ -3014,7 +3640,7 @@
                 <w:noProof/>
                 <w:webHidden/>
               </w:rPr>
-              <w:t>31</w:t>
+              <w:t>36</w:t>
             </w:r>
             <w:r>
               <w:rPr>
@@ -3038,7 +3664,7 @@
               <w:szCs w:val="24"/>
             </w:rPr>
           </w:pPr>
-          <w:hyperlink w:anchor="_Toc204350006" w:history="1">
+          <w:hyperlink w:anchor="_Toc207985133" w:history="1">
             <w:r>
               <w:rPr>
                 <w:rStyle w:val="Hyperlink"/>
@@ -3065,7 +3691,7 @@
                 <w:noProof/>
                 <w:webHidden/>
               </w:rPr>
-              <w:instrText xml:space="preserve"> PAGEREF _Toc204350006 \h </w:instrText>
+              <w:instrText xml:space="preserve"> PAGEREF _Toc207985133 \h </w:instrText>
             </w:r>
             <w:r>
               <w:rPr>
@@ -3085,7 +3711,7 @@
                 <w:noProof/>
                 <w:webHidden/>
               </w:rPr>
-              <w:t>31</w:t>
+              <w:t>36</w:t>
             </w:r>
             <w:r>
               <w:rPr>
@@ -3192,9 +3818,8 @@
       <w:pPr>
         <w:pStyle w:val="Heading1"/>
       </w:pPr>
-      <w:bookmarkStart w:id="0" w:name="_Toc204349964"/>
-      <w:r>
-        <w:lastRenderedPageBreak/>
+      <w:bookmarkStart w:id="0" w:name="_Toc207985082"/>
+      <w:r>
         <w:t>GHR BANK INTERFACE</w:t>
       </w:r>
       <w:bookmarkEnd w:id="0"/>
@@ -3254,7 +3879,7 @@
       <w:pPr>
         <w:pStyle w:val="Heading2"/>
       </w:pPr>
-      <w:bookmarkStart w:id="1" w:name="_Toc204349965"/>
+      <w:bookmarkStart w:id="1" w:name="_Toc207985083"/>
       <w:r>
         <w:t>Step 1 – HCM</w:t>
       </w:r>
@@ -3371,6 +3996,7 @@
         <w:rPr>
           <w:noProof/>
         </w:rPr>
+        <w:lastRenderedPageBreak/>
         <w:drawing>
           <wp:inline distT="0" distB="0" distL="0" distR="0" wp14:anchorId="291B858A" wp14:editId="1FDEC2DF">
             <wp:extent cx="2210108" cy="895475"/>
@@ -3413,9 +4039,8 @@
       <w:pPr>
         <w:pStyle w:val="Heading2"/>
       </w:pPr>
-      <w:bookmarkStart w:id="2" w:name="_Toc204349966"/>
-      <w:r>
-        <w:lastRenderedPageBreak/>
+      <w:bookmarkStart w:id="2" w:name="_Toc207985084"/>
+      <w:r>
         <w:t>Step 2 – S00</w:t>
       </w:r>
       <w:r>
@@ -3522,7 +4147,7 @@
       <w:pPr>
         <w:pStyle w:val="Heading2"/>
       </w:pPr>
-      <w:bookmarkStart w:id="3" w:name="_Toc204349967"/>
+      <w:bookmarkStart w:id="3" w:name="_Toc207985085"/>
       <w:r>
         <w:t>Step 3 – S01</w:t>
       </w:r>
@@ -3592,7 +4217,7 @@
       <w:pPr>
         <w:pStyle w:val="Heading2"/>
       </w:pPr>
-      <w:bookmarkStart w:id="4" w:name="_Toc204349968"/>
+      <w:bookmarkStart w:id="4" w:name="_Toc207985086"/>
       <w:r>
         <w:t>Step 4 – S03</w:t>
       </w:r>
@@ -3745,7 +4370,7 @@
       <w:pPr>
         <w:pStyle w:val="Heading2"/>
       </w:pPr>
-      <w:bookmarkStart w:id="5" w:name="_Toc204349969"/>
+      <w:bookmarkStart w:id="5" w:name="_Toc207985087"/>
       <w:r>
         <w:t>Step 5 – AUDIT</w:t>
       </w:r>
@@ -3825,7 +4450,7 @@
       <w:pPr>
         <w:pStyle w:val="Heading2"/>
       </w:pPr>
-      <w:bookmarkStart w:id="6" w:name="_Toc204349970"/>
+      <w:bookmarkStart w:id="6" w:name="_Toc207985088"/>
       <w:r>
         <w:lastRenderedPageBreak/>
         <w:t>STEP 1 – EXTRACT</w:t>
@@ -4104,7 +4729,7 @@
       <w:pPr>
         <w:pStyle w:val="Heading2"/>
       </w:pPr>
-      <w:bookmarkStart w:id="7" w:name="_Toc204349971"/>
+      <w:bookmarkStart w:id="7" w:name="_Toc207985089"/>
       <w:r>
         <w:t>Step 3 – Program SENDAUDIT</w:t>
       </w:r>
@@ -4229,7 +4854,7 @@
       <w:pPr>
         <w:pStyle w:val="Heading2"/>
       </w:pPr>
-      <w:bookmarkStart w:id="8" w:name="_Toc204349972"/>
+      <w:bookmarkStart w:id="8" w:name="_Toc207985090"/>
       <w:r>
         <w:t>Step 6 – REPORT</w:t>
       </w:r>
@@ -4360,7 +4985,7 @@
       <w:pPr>
         <w:pStyle w:val="Heading1"/>
       </w:pPr>
-      <w:bookmarkStart w:id="9" w:name="_Toc204349973"/>
+      <w:bookmarkStart w:id="9" w:name="_Toc207985091"/>
       <w:r>
         <w:t>GHR EVENT</w:t>
       </w:r>
@@ -4420,7 +5045,7 @@
       <w:pPr>
         <w:pStyle w:val="Heading2"/>
       </w:pPr>
-      <w:bookmarkStart w:id="10" w:name="_Toc204349974"/>
+      <w:bookmarkStart w:id="10" w:name="_Toc207985092"/>
       <w:r>
         <w:t>Step 1 – EVENT</w:t>
       </w:r>
@@ -4543,7 +5168,7 @@
       <w:pPr>
         <w:pStyle w:val="Heading1"/>
       </w:pPr>
-      <w:bookmarkStart w:id="11" w:name="_Toc204349975"/>
+      <w:bookmarkStart w:id="11" w:name="_Toc207985093"/>
       <w:r>
         <w:lastRenderedPageBreak/>
         <w:t>GHR EVENT2</w:t>
@@ -4604,7 +5229,7 @@
       <w:pPr>
         <w:pStyle w:val="Heading2"/>
       </w:pPr>
-      <w:bookmarkStart w:id="12" w:name="_Toc204349976"/>
+      <w:bookmarkStart w:id="12" w:name="_Toc207985094"/>
       <w:r>
         <w:t>Step 1 – EVENT</w:t>
       </w:r>
@@ -4727,7 +5352,7 @@
       <w:pPr>
         <w:pStyle w:val="Heading1"/>
       </w:pPr>
-      <w:bookmarkStart w:id="13" w:name="_Toc204349977"/>
+      <w:bookmarkStart w:id="13" w:name="_Toc207985095"/>
       <w:r>
         <w:lastRenderedPageBreak/>
         <w:t>GHR EXTRACT_BANK_DATA</w:t>
@@ -4793,7 +5418,7 @@
       <w:pPr>
         <w:pStyle w:val="Heading2"/>
       </w:pPr>
-      <w:bookmarkStart w:id="14" w:name="_Toc204349978"/>
+      <w:bookmarkStart w:id="14" w:name="_Toc207985096"/>
       <w:r>
         <w:t>STEP 1 – EXTRACT</w:t>
       </w:r>
@@ -4915,7 +5540,7 @@
       <w:pPr>
         <w:pStyle w:val="Heading2"/>
       </w:pPr>
-      <w:bookmarkStart w:id="15" w:name="_Toc204349979"/>
+      <w:bookmarkStart w:id="15" w:name="_Toc207985097"/>
       <w:r>
         <w:t xml:space="preserve">Step 2 – </w:t>
       </w:r>
@@ -5084,7 +5709,7 @@
       <w:pPr>
         <w:pStyle w:val="Heading2"/>
       </w:pPr>
-      <w:bookmarkStart w:id="16" w:name="_Toc204349980"/>
+      <w:bookmarkStart w:id="16" w:name="_Toc207985098"/>
       <w:r>
         <w:t xml:space="preserve">Step 3 – </w:t>
       </w:r>
@@ -5206,7 +5831,7 @@
       <w:pPr>
         <w:pStyle w:val="Heading1"/>
       </w:pPr>
-      <w:bookmarkStart w:id="17" w:name="_Toc204349981"/>
+      <w:bookmarkStart w:id="17" w:name="_Toc207985099"/>
       <w:r>
         <w:lastRenderedPageBreak/>
         <w:t>GHR EXTRACT_DATA</w:t>
@@ -5267,7 +5892,7 @@
       <w:pPr>
         <w:pStyle w:val="Heading2"/>
       </w:pPr>
-      <w:bookmarkStart w:id="18" w:name="_Toc204349982"/>
+      <w:bookmarkStart w:id="18" w:name="_Toc207985100"/>
       <w:r>
         <w:t>Step 1 – EXTRACT</w:t>
       </w:r>
@@ -5475,7 +6100,7 @@
       <w:pPr>
         <w:pStyle w:val="Heading2"/>
       </w:pPr>
-      <w:bookmarkStart w:id="19" w:name="_Toc204349983"/>
+      <w:bookmarkStart w:id="19" w:name="_Toc207985101"/>
       <w:r>
         <w:t>Step 2 – AUDIT</w:t>
       </w:r>
@@ -5659,7 +6284,7 @@
       <w:pPr>
         <w:pStyle w:val="Heading2"/>
       </w:pPr>
-      <w:bookmarkStart w:id="20" w:name="_Toc204349984"/>
+      <w:bookmarkStart w:id="20" w:name="_Toc207985102"/>
       <w:r>
         <w:t>Step 3 – SMTP</w:t>
       </w:r>
@@ -5785,7 +6410,7 @@
       <w:pPr>
         <w:pStyle w:val="Heading1"/>
       </w:pPr>
-      <w:bookmarkStart w:id="21" w:name="_Toc204349985"/>
+      <w:bookmarkStart w:id="21" w:name="_Toc207985103"/>
       <w:r>
         <w:lastRenderedPageBreak/>
         <w:t>GHR EXTRACT_PE_DATA</w:t>
@@ -5846,7 +6471,7 @@
       <w:pPr>
         <w:pStyle w:val="Heading2"/>
       </w:pPr>
-      <w:bookmarkStart w:id="22" w:name="_Toc204349986"/>
+      <w:bookmarkStart w:id="22" w:name="_Toc207985104"/>
       <w:r>
         <w:t>Step 1 – EXTRACT</w:t>
       </w:r>
@@ -6023,7 +6648,7 @@
       <w:r>
         <w:br w:type="page"/>
       </w:r>
-      <w:bookmarkStart w:id="23" w:name="_Toc204349987"/>
+      <w:bookmarkStart w:id="23" w:name="_Toc207985105"/>
       <w:r>
         <w:lastRenderedPageBreak/>
         <w:t>GHR INTERFACES</w:t>
@@ -6084,7 +6709,7 @@
       <w:pPr>
         <w:pStyle w:val="Heading2"/>
       </w:pPr>
-      <w:bookmarkStart w:id="24" w:name="_Toc204349988"/>
+      <w:bookmarkStart w:id="24" w:name="_Toc207985106"/>
       <w:r>
         <w:t>Step 1 – HCM</w:t>
       </w:r>
@@ -6247,7 +6872,7 @@
       <w:pPr>
         <w:pStyle w:val="Heading2"/>
       </w:pPr>
-      <w:bookmarkStart w:id="25" w:name="_Toc204349989"/>
+      <w:bookmarkStart w:id="25" w:name="_Toc207985107"/>
       <w:r>
         <w:lastRenderedPageBreak/>
         <w:t>Step 2 – S00</w:t>
@@ -6364,7 +6989,7 @@
       <w:pPr>
         <w:pStyle w:val="Heading2"/>
       </w:pPr>
-      <w:bookmarkStart w:id="26" w:name="_Toc204349990"/>
+      <w:bookmarkStart w:id="26" w:name="_Toc207985108"/>
       <w:r>
         <w:t>Step 3 – S01</w:t>
       </w:r>
@@ -8055,7 +8680,7 @@
       <w:pPr>
         <w:pStyle w:val="Heading2"/>
       </w:pPr>
-      <w:bookmarkStart w:id="27" w:name="_Toc204349991"/>
+      <w:bookmarkStart w:id="27" w:name="_Toc207985109"/>
       <w:r>
         <w:t>Step 4 – S03</w:t>
       </w:r>
@@ -8227,10 +8852,12 @@
       <w:pPr>
         <w:pStyle w:val="Heading3"/>
       </w:pPr>
+      <w:bookmarkStart w:id="28" w:name="_Toc207985110"/>
       <w:r>
         <w:lastRenderedPageBreak/>
         <w:t>New Hire</w:t>
       </w:r>
+      <w:bookmarkEnd w:id="28"/>
     </w:p>
     <w:p>
       <w:pPr>
@@ -9206,9 +9833,11 @@
       <w:pPr>
         <w:pStyle w:val="Heading3"/>
       </w:pPr>
+      <w:bookmarkStart w:id="29" w:name="_Toc207985111"/>
       <w:r>
         <w:t>Salary Change</w:t>
       </w:r>
+      <w:bookmarkEnd w:id="29"/>
     </w:p>
     <w:p>
       <w:pPr>
@@ -9822,10 +10451,12 @@
       <w:pPr>
         <w:pStyle w:val="Heading3"/>
       </w:pPr>
+      <w:bookmarkStart w:id="30" w:name="_Toc207985112"/>
       <w:r>
         <w:lastRenderedPageBreak/>
         <w:t>Transfer</w:t>
       </w:r>
+      <w:bookmarkEnd w:id="30"/>
     </w:p>
     <w:p>
       <w:pPr>
@@ -10547,10 +11178,12 @@
       <w:pPr>
         <w:pStyle w:val="Heading3"/>
       </w:pPr>
+      <w:bookmarkStart w:id="31" w:name="_Toc207985113"/>
       <w:r>
         <w:lastRenderedPageBreak/>
         <w:t>Name Change</w:t>
       </w:r>
+      <w:bookmarkEnd w:id="31"/>
     </w:p>
     <w:p>
       <w:pPr>
@@ -10999,9 +11632,11 @@
       <w:pPr>
         <w:pStyle w:val="Heading3"/>
       </w:pPr>
+      <w:bookmarkStart w:id="32" w:name="_Toc207985114"/>
       <w:r>
         <w:t>Status Change</w:t>
       </w:r>
+      <w:bookmarkEnd w:id="32"/>
     </w:p>
     <w:p>
       <w:pPr>
@@ -11908,9 +12543,11 @@
       <w:pPr>
         <w:pStyle w:val="Heading3"/>
       </w:pPr>
+      <w:bookmarkStart w:id="33" w:name="_Toc207985115"/>
       <w:r>
         <w:t>Pay Allowances</w:t>
       </w:r>
+      <w:bookmarkEnd w:id="33"/>
     </w:p>
     <w:p>
       <w:pPr>
@@ -12485,22 +13122,18 @@
       <w:pPr>
         <w:pStyle w:val="Heading3"/>
       </w:pPr>
+      <w:bookmarkStart w:id="34" w:name="_Toc207985116"/>
       <w:r>
         <w:t>Update Pay Group</w:t>
       </w:r>
+      <w:bookmarkEnd w:id="34"/>
     </w:p>
     <w:p>
       <w:pPr>
         <w:pStyle w:val="Heading4"/>
       </w:pPr>
       <w:r>
-        <w:t>Event ID: ‘0</w:t>
-      </w:r>
-      <w:r>
-        <w:t>8</w:t>
-      </w:r>
-      <w:r>
-        <w:t>’</w:t>
+        <w:t>Event ID: ‘08’</w:t>
       </w:r>
     </w:p>
     <w:p/>
@@ -12625,10 +13258,7 @@
           </w:tcPr>
           <w:p>
             <w:r>
-              <w:t>U00</w:t>
-            </w:r>
-            <w:r>
-              <w:t>1</w:t>
+              <w:t>U001</w:t>
             </w:r>
             <w:r>
               <w:t>15</w:t>
@@ -13038,22 +13668,18 @@
       <w:pPr>
         <w:pStyle w:val="Heading3"/>
       </w:pPr>
+      <w:bookmarkStart w:id="35" w:name="_Toc207985117"/>
       <w:r>
         <w:t>Update Labor Group</w:t>
       </w:r>
+      <w:bookmarkEnd w:id="35"/>
     </w:p>
     <w:p>
       <w:pPr>
         <w:pStyle w:val="Heading4"/>
       </w:pPr>
       <w:r>
-        <w:t>Event ID: ‘0</w:t>
-      </w:r>
-      <w:r>
-        <w:t>9</w:t>
-      </w:r>
-      <w:r>
-        <w:t>’</w:t>
+        <w:t>Event ID: ‘09’</w:t>
       </w:r>
     </w:p>
     <w:p/>
@@ -13066,10 +13692,7 @@
         <w:t>DBShrpn.dbo.usp_ins_</w:t>
       </w:r>
       <w:r>
-        <w:t>labor</w:t>
-      </w:r>
-      <w:r>
-        <w:t>_group</w:t>
+        <w:t>labor_group</w:t>
       </w:r>
       <w:proofErr w:type="spellEnd"/>
     </w:p>
@@ -13181,10 +13804,7 @@
           </w:tcPr>
           <w:p>
             <w:r>
-              <w:t>U0010</w:t>
-            </w:r>
-            <w:r>
-              <w:t>7</w:t>
+              <w:t>U00107</w:t>
             </w:r>
           </w:p>
         </w:tc>
@@ -13701,22 +14321,18 @@
       <w:pPr>
         <w:pStyle w:val="Heading3"/>
       </w:pPr>
+      <w:bookmarkStart w:id="36" w:name="_Toc207985118"/>
       <w:r>
         <w:t>Update Position Title</w:t>
       </w:r>
+      <w:bookmarkEnd w:id="36"/>
     </w:p>
     <w:p>
       <w:pPr>
         <w:pStyle w:val="Heading4"/>
       </w:pPr>
       <w:r>
-        <w:t>Event ID: ‘</w:t>
-      </w:r>
-      <w:r>
-        <w:t>10</w:t>
-      </w:r>
-      <w:r>
-        <w:t>’</w:t>
+        <w:t>Event ID: ‘10’</w:t>
       </w:r>
     </w:p>
     <w:p/>
@@ -13729,10 +14345,7 @@
         <w:t>DBShrpn.dbo.usp_ins_</w:t>
       </w:r>
       <w:r>
-        <w:t>p</w:t>
-      </w:r>
-      <w:r>
-        <w:t>osition_title</w:t>
+        <w:t>position_title</w:t>
       </w:r>
       <w:proofErr w:type="spellEnd"/>
     </w:p>
@@ -13845,10 +14458,7 @@
           </w:tcPr>
           <w:p>
             <w:r>
-              <w:t>U00</w:t>
-            </w:r>
-            <w:r>
-              <w:t>115</w:t>
+              <w:t>U00115</w:t>
             </w:r>
           </w:p>
         </w:tc>
@@ -13880,10 +14490,7 @@
           </w:tcPr>
           <w:p>
             <w:r>
-              <w:t>U00</w:t>
-            </w:r>
-            <w:r>
-              <w:t>009</w:t>
+              <w:t>U00009</w:t>
             </w:r>
           </w:p>
         </w:tc>
@@ -14047,10 +14654,7 @@
           </w:tcPr>
           <w:p>
             <w:r>
-              <w:t>U001</w:t>
-            </w:r>
-            <w:r>
-              <w:t>16</w:t>
+              <w:t>U00116</w:t>
             </w:r>
           </w:p>
         </w:tc>
@@ -14088,10 +14692,7 @@
           </w:tcPr>
           <w:p>
             <w:r>
-              <w:t>U001</w:t>
-            </w:r>
-            <w:r>
-              <w:t>17</w:t>
+              <w:t>U00117</w:t>
             </w:r>
           </w:p>
         </w:tc>
@@ -14123,10 +14724,7 @@
           </w:tcPr>
           <w:p>
             <w:r>
-              <w:t>U0011</w:t>
-            </w:r>
-            <w:r>
-              <w:t>8</w:t>
+              <w:t>U00118</w:t>
             </w:r>
           </w:p>
         </w:tc>
@@ -14277,11 +14875,11 @@
       <w:pPr>
         <w:pStyle w:val="Heading2"/>
       </w:pPr>
-      <w:bookmarkStart w:id="28" w:name="_Toc204349992"/>
+      <w:bookmarkStart w:id="37" w:name="_Toc207985119"/>
       <w:r>
         <w:t>Step 5 – AUDIT</w:t>
       </w:r>
-      <w:bookmarkEnd w:id="28"/>
+      <w:bookmarkEnd w:id="37"/>
     </w:p>
     <w:p>
       <w:pPr>
@@ -14350,12 +14948,12 @@
       <w:pPr>
         <w:pStyle w:val="Heading2"/>
       </w:pPr>
-      <w:bookmarkStart w:id="29" w:name="_Toc204349993"/>
+      <w:bookmarkStart w:id="38" w:name="_Toc207985120"/>
       <w:r>
         <w:lastRenderedPageBreak/>
         <w:t>Step 6 – REPORT</w:t>
       </w:r>
-      <w:bookmarkEnd w:id="29"/>
+      <w:bookmarkEnd w:id="38"/>
     </w:p>
     <w:p>
       <w:pPr>
@@ -14679,11 +15277,11 @@
       <w:pPr>
         <w:pStyle w:val="Heading1"/>
       </w:pPr>
-      <w:bookmarkStart w:id="30" w:name="_Toc204349994"/>
+      <w:bookmarkStart w:id="39" w:name="_Toc207985121"/>
       <w:r>
         <w:t>GHR PAYSLIP_INTERFACE</w:t>
       </w:r>
-      <w:bookmarkEnd w:id="30"/>
+      <w:bookmarkEnd w:id="39"/>
     </w:p>
     <w:p>
       <w:pPr>
@@ -14739,11 +15337,11 @@
       <w:pPr>
         <w:pStyle w:val="Heading2"/>
       </w:pPr>
-      <w:bookmarkStart w:id="31" w:name="_Toc204349995"/>
+      <w:bookmarkStart w:id="40" w:name="_Toc207985122"/>
       <w:r>
         <w:t>Step 1 – EXT</w:t>
       </w:r>
-      <w:bookmarkEnd w:id="31"/>
+      <w:bookmarkEnd w:id="40"/>
     </w:p>
     <w:p>
       <w:pPr>
@@ -14909,12 +15507,12 @@
       <w:pPr>
         <w:spacing w:after="0"/>
       </w:pPr>
-      <w:bookmarkStart w:id="32" w:name="_Hlk199324204"/>
+      <w:bookmarkStart w:id="41" w:name="_Hlk199324204"/>
       <w:proofErr w:type="spellStart"/>
       <w:r>
         <w:t>DBShrpy.dbo.usp_payslip_ext</w:t>
       </w:r>
-      <w:bookmarkEnd w:id="32"/>
+      <w:bookmarkEnd w:id="41"/>
       <w:proofErr w:type="spellEnd"/>
     </w:p>
     <w:p>
@@ -14954,11 +15552,11 @@
       <w:pPr>
         <w:pStyle w:val="Heading2"/>
       </w:pPr>
-      <w:bookmarkStart w:id="33" w:name="_Toc204349996"/>
+      <w:bookmarkStart w:id="42" w:name="_Toc207985123"/>
       <w:r>
         <w:t>Step 2 – NETPAY</w:t>
       </w:r>
-      <w:bookmarkEnd w:id="33"/>
+      <w:bookmarkEnd w:id="42"/>
     </w:p>
     <w:p>
       <w:pPr>
@@ -15087,11 +15685,11 @@
       <w:pPr>
         <w:pStyle w:val="Heading2"/>
       </w:pPr>
-      <w:bookmarkStart w:id="34" w:name="_Toc204349997"/>
+      <w:bookmarkStart w:id="43" w:name="_Toc207985124"/>
       <w:r>
         <w:t>Step 3 – EARN</w:t>
       </w:r>
-      <w:bookmarkEnd w:id="34"/>
+      <w:bookmarkEnd w:id="43"/>
     </w:p>
     <w:p>
       <w:pPr>
@@ -15207,11 +15805,11 @@
       <w:pPr>
         <w:pStyle w:val="Heading2"/>
       </w:pPr>
-      <w:bookmarkStart w:id="35" w:name="_Toc204349998"/>
+      <w:bookmarkStart w:id="44" w:name="_Toc207985125"/>
       <w:r>
         <w:t>Step 4 – DEDUC</w:t>
       </w:r>
-      <w:bookmarkEnd w:id="35"/>
+      <w:bookmarkEnd w:id="44"/>
     </w:p>
     <w:p>
       <w:pPr>
@@ -15339,12 +15937,12 @@
       <w:pPr>
         <w:pStyle w:val="Heading2"/>
       </w:pPr>
-      <w:bookmarkStart w:id="36" w:name="_Toc204349999"/>
+      <w:bookmarkStart w:id="45" w:name="_Toc207985126"/>
       <w:r>
         <w:lastRenderedPageBreak/>
         <w:t>Step 5 – EARNDUD</w:t>
       </w:r>
-      <w:bookmarkEnd w:id="36"/>
+      <w:bookmarkEnd w:id="45"/>
     </w:p>
     <w:p>
       <w:pPr>
@@ -15366,7 +15964,7 @@
           <w:noProof/>
         </w:rPr>
         <w:drawing>
-          <wp:anchor distT="0" distB="0" distL="114300" distR="114300" simplePos="0" relativeHeight="251658240" behindDoc="0" locked="0" layoutInCell="1" allowOverlap="1" wp14:anchorId="1006FBA5" wp14:editId="59686078">
+          <wp:anchor distT="0" distB="0" distL="114300" distR="114300" simplePos="0" relativeHeight="251658240" behindDoc="0" locked="0" layoutInCell="1" allowOverlap="1" wp14:anchorId="1006FBA5" wp14:editId="517B8874">
             <wp:simplePos x="914400" y="1746250"/>
             <wp:positionH relativeFrom="column">
               <wp:align>left</wp:align>
@@ -15466,11 +16064,11 @@
       <w:pPr>
         <w:pStyle w:val="Heading2"/>
       </w:pPr>
-      <w:bookmarkStart w:id="37" w:name="_Toc204350000"/>
+      <w:bookmarkStart w:id="46" w:name="_Toc207985127"/>
       <w:r>
         <w:t>Step 6 – SENDFILE</w:t>
       </w:r>
-      <w:bookmarkEnd w:id="37"/>
+      <w:bookmarkEnd w:id="46"/>
     </w:p>
     <w:p>
       <w:pPr>
@@ -15593,12 +16191,12 @@
       <w:pPr>
         <w:pStyle w:val="Heading1"/>
       </w:pPr>
-      <w:bookmarkStart w:id="38" w:name="_Toc204350001"/>
+      <w:bookmarkStart w:id="47" w:name="_Toc207985128"/>
       <w:r>
         <w:lastRenderedPageBreak/>
         <w:t>GHR RUN_EVENT</w:t>
       </w:r>
-      <w:bookmarkEnd w:id="38"/>
+      <w:bookmarkEnd w:id="47"/>
     </w:p>
     <w:p>
       <w:pPr>
@@ -15649,11 +16247,11 @@
       <w:pPr>
         <w:pStyle w:val="Heading2"/>
       </w:pPr>
-      <w:bookmarkStart w:id="39" w:name="_Toc204350002"/>
+      <w:bookmarkStart w:id="48" w:name="_Toc207985129"/>
       <w:r>
         <w:t>Step 1 – RUN</w:t>
       </w:r>
-      <w:bookmarkEnd w:id="39"/>
+      <w:bookmarkEnd w:id="48"/>
     </w:p>
     <w:p>
       <w:pPr>
@@ -15751,12 +16349,12 @@
       <w:pPr>
         <w:pStyle w:val="Heading1"/>
       </w:pPr>
-      <w:bookmarkStart w:id="40" w:name="_Toc204350003"/>
+      <w:bookmarkStart w:id="49" w:name="_Toc207985130"/>
       <w:r>
         <w:lastRenderedPageBreak/>
         <w:t>GHR SRV_TO_SRV_COPY</w:t>
       </w:r>
-      <w:bookmarkEnd w:id="40"/>
+      <w:bookmarkEnd w:id="49"/>
     </w:p>
     <w:p>
       <w:pPr>
@@ -15812,11 +16410,11 @@
       <w:pPr>
         <w:pStyle w:val="Heading2"/>
       </w:pPr>
-      <w:bookmarkStart w:id="41" w:name="_Toc204350004"/>
+      <w:bookmarkStart w:id="50" w:name="_Toc207985131"/>
       <w:r>
         <w:t>Step 1 – FTP</w:t>
       </w:r>
-      <w:bookmarkEnd w:id="41"/>
+      <w:bookmarkEnd w:id="50"/>
     </w:p>
     <w:p>
       <w:pPr>
@@ -15928,12 +16526,12 @@
       <w:pPr>
         <w:pStyle w:val="Heading1"/>
       </w:pPr>
-      <w:bookmarkStart w:id="42" w:name="_Toc204350005"/>
+      <w:bookmarkStart w:id="51" w:name="_Toc207985132"/>
       <w:r>
         <w:lastRenderedPageBreak/>
         <w:t>GHR VERIFICATION_0000</w:t>
       </w:r>
-      <w:bookmarkEnd w:id="42"/>
+      <w:bookmarkEnd w:id="51"/>
     </w:p>
     <w:p>
       <w:pPr>
@@ -15989,11 +16587,11 @@
       <w:pPr>
         <w:pStyle w:val="Heading2"/>
       </w:pPr>
-      <w:bookmarkStart w:id="43" w:name="_Toc204350006"/>
+      <w:bookmarkStart w:id="52" w:name="_Toc207985133"/>
       <w:r>
         <w:t>Step 1 – VER01</w:t>
       </w:r>
-      <w:bookmarkEnd w:id="43"/>
+      <w:bookmarkEnd w:id="52"/>
     </w:p>
     <w:p>
       <w:pPr>
@@ -16841,6 +17439,7 @@
   <w:style w:type="character" w:default="1" w:styleId="DefaultParagraphFont">
     <w:name w:val="Default Paragraph Font"/>
     <w:uiPriority w:val="1"/>
+    <w:semiHidden/>
     <w:unhideWhenUsed/>
   </w:style>
   <w:style w:type="table" w:default="1" w:styleId="TableNormal">
@@ -17269,6 +17868,19 @@
       </w:tblBorders>
     </w:tblPr>
   </w:style>
+  <w:style w:type="paragraph" w:styleId="TOC3">
+    <w:name w:val="toc 3"/>
+    <w:basedOn w:val="Normal"/>
+    <w:next w:val="Normal"/>
+    <w:autoRedefine/>
+    <w:uiPriority w:val="39"/>
+    <w:unhideWhenUsed/>
+    <w:rsid w:val="006211EB"/>
+    <w:pPr>
+      <w:spacing w:after="100"/>
+      <w:ind w:left="440"/>
+    </w:pPr>
+  </w:style>
 </w:styles>
 </file>
 

</xml_diff>

<commit_message>
update 20251209 before message master loop change
</commit_message>
<xml_diff>
--- a/GHR Interface Job Scheduler Setup.docx
+++ b/GHR Interface Job Scheduler Setup.docx
@@ -4283,33 +4283,41 @@
       <w:pPr>
         <w:spacing w:after="0"/>
       </w:pPr>
+      <w:proofErr w:type="spellStart"/>
       <w:r>
         <w:t>DBSpscb.dbo.psc_step</w:t>
       </w:r>
-    </w:p>
-    <w:p>
-      <w:pPr>
-        <w:spacing w:after="0"/>
-      </w:pPr>
+      <w:proofErr w:type="spellEnd"/>
+    </w:p>
+    <w:p>
+      <w:pPr>
+        <w:spacing w:after="0"/>
+      </w:pPr>
+      <w:proofErr w:type="spellStart"/>
       <w:r>
         <w:t>DBSentp.dbo.batch_parameters</w:t>
       </w:r>
-    </w:p>
-    <w:p>
-      <w:pPr>
-        <w:spacing w:after="0"/>
-      </w:pPr>
+      <w:proofErr w:type="spellEnd"/>
+    </w:p>
+    <w:p>
+      <w:pPr>
+        <w:spacing w:after="0"/>
+      </w:pPr>
+      <w:proofErr w:type="spellStart"/>
       <w:r>
         <w:t>DBShrpn.dbo.ghr_bankinfo_events_aud</w:t>
       </w:r>
-    </w:p>
-    <w:p>
-      <w:pPr>
-        <w:spacing w:after="0"/>
-      </w:pPr>
+      <w:proofErr w:type="spellEnd"/>
+    </w:p>
+    <w:p>
+      <w:pPr>
+        <w:spacing w:after="0"/>
+      </w:pPr>
+      <w:proofErr w:type="spellStart"/>
       <w:r>
         <w:t>DBShrpn.dbo.ghr_bankinfo_events</w:t>
       </w:r>
+      <w:proofErr w:type="spellEnd"/>
     </w:p>
     <w:p>
       <w:pPr>
@@ -4328,9 +4336,11 @@
       <w:pPr>
         <w:spacing w:after="0"/>
       </w:pPr>
+      <w:proofErr w:type="spellStart"/>
       <w:r>
         <w:t>DBShrpn.dbo.usp_ins_bankinfo</w:t>
       </w:r>
+      <w:proofErr w:type="spellEnd"/>
     </w:p>
     <w:p>
       <w:pPr>
@@ -4354,7 +4364,15 @@
         <w:t xml:space="preserve"> </w:t>
       </w:r>
       <w:r>
-        <w:t xml:space="preserve">Start A Job </w:t>
+        <w:t xml:space="preserve">Start </w:t>
+      </w:r>
+      <w:proofErr w:type="gramStart"/>
+      <w:r>
+        <w:t>A</w:t>
+      </w:r>
+      <w:proofErr w:type="gramEnd"/>
+      <w:r>
+        <w:t xml:space="preserve"> Job </w:t>
       </w:r>
       <w:r>
         <w:t xml:space="preserve">- </w:t>
@@ -4508,18 +4526,22 @@
         <w:spacing w:after="0"/>
         <w:ind w:left="720"/>
       </w:pPr>
+      <w:proofErr w:type="spellStart"/>
       <w:r>
         <w:t>DBShrpn.dbo.emp_pay_element</w:t>
       </w:r>
+      <w:proofErr w:type="spellEnd"/>
     </w:p>
     <w:p>
       <w:pPr>
         <w:spacing w:after="0"/>
         <w:ind w:left="720"/>
       </w:pPr>
+      <w:proofErr w:type="spellStart"/>
       <w:r>
         <w:t>DBShrpn.dbo.emp_status</w:t>
       </w:r>
+      <w:proofErr w:type="spellEnd"/>
     </w:p>
     <w:p/>
     <w:p>
@@ -4894,9 +4916,11 @@
       <w:pPr>
         <w:spacing w:after="0"/>
       </w:pPr>
+      <w:proofErr w:type="spellStart"/>
       <w:r>
         <w:t>DBShrpn.dbo.ghr_bankinfo_events_aud</w:t>
       </w:r>
+      <w:proofErr w:type="spellEnd"/>
     </w:p>
     <w:p>
       <w:pPr>
@@ -4931,10 +4955,12 @@
       <w:pPr>
         <w:spacing w:after="0"/>
       </w:pPr>
+      <w:proofErr w:type="spellStart"/>
       <w:r>
         <w:lastRenderedPageBreak/>
         <w:t>DBShrpn.dbo.ghr_historical_message</w:t>
       </w:r>
+      <w:proofErr w:type="spellEnd"/>
     </w:p>
     <w:p>
       <w:pPr>
@@ -5470,17 +5496,21 @@
       <w:pPr>
         <w:spacing w:after="0"/>
       </w:pPr>
+      <w:proofErr w:type="spellStart"/>
       <w:r>
         <w:t>DBShrpn.dbo.emp_pay_element</w:t>
       </w:r>
-    </w:p>
-    <w:p>
-      <w:pPr>
-        <w:spacing w:after="0"/>
-      </w:pPr>
+      <w:proofErr w:type="spellEnd"/>
+    </w:p>
+    <w:p>
+      <w:pPr>
+        <w:spacing w:after="0"/>
+      </w:pPr>
+      <w:proofErr w:type="spellStart"/>
       <w:r>
         <w:t>DBShrpn.dbo.emp_status</w:t>
       </w:r>
+      <w:proofErr w:type="spellEnd"/>
     </w:p>
     <w:p>
       <w:pPr>
@@ -5939,76 +5969,100 @@
         <w:t>DBShrpn.dbo.ghr_current_temp1</w:t>
       </w:r>
       <w:r>
-        <w:t xml:space="preserve"> (Drops/creates if tables exists)</w:t>
-      </w:r>
-    </w:p>
-    <w:p>
-      <w:pPr>
-        <w:spacing w:after="0"/>
-      </w:pPr>
+        <w:t xml:space="preserve"> (Drops/creates if tables </w:t>
+      </w:r>
+      <w:proofErr w:type="gramStart"/>
+      <w:r>
+        <w:t>exists</w:t>
+      </w:r>
+      <w:proofErr w:type="gramEnd"/>
+      <w:r>
+        <w:t>)</w:t>
+      </w:r>
+    </w:p>
+    <w:p>
+      <w:pPr>
+        <w:spacing w:after="0"/>
+      </w:pPr>
+      <w:proofErr w:type="spellStart"/>
       <w:r>
         <w:t>DBShrpn.dbo.employee</w:t>
       </w:r>
-    </w:p>
-    <w:p>
-      <w:pPr>
-        <w:spacing w:after="0"/>
-      </w:pPr>
+      <w:proofErr w:type="spellEnd"/>
+    </w:p>
+    <w:p>
+      <w:pPr>
+        <w:spacing w:after="0"/>
+      </w:pPr>
+      <w:proofErr w:type="spellStart"/>
       <w:r>
         <w:t>DBShrpn.dbo.individual</w:t>
       </w:r>
-    </w:p>
-    <w:p>
-      <w:pPr>
-        <w:spacing w:after="0"/>
-      </w:pPr>
+      <w:proofErr w:type="spellEnd"/>
+    </w:p>
+    <w:p>
+      <w:pPr>
+        <w:spacing w:after="0"/>
+      </w:pPr>
+      <w:proofErr w:type="spellStart"/>
       <w:r>
         <w:t>DBShrpn.dbo.individual_personal</w:t>
       </w:r>
-    </w:p>
-    <w:p>
-      <w:pPr>
-        <w:spacing w:after="0"/>
-      </w:pPr>
+      <w:proofErr w:type="spellEnd"/>
+    </w:p>
+    <w:p>
+      <w:pPr>
+        <w:spacing w:after="0"/>
+      </w:pPr>
+      <w:proofErr w:type="spellStart"/>
       <w:r>
         <w:t>DBShrpn.dbo.emp_employment</w:t>
       </w:r>
-    </w:p>
-    <w:p>
-      <w:pPr>
-        <w:spacing w:after="0"/>
-      </w:pPr>
+      <w:proofErr w:type="spellEnd"/>
+    </w:p>
+    <w:p>
+      <w:pPr>
+        <w:spacing w:after="0"/>
+      </w:pPr>
+      <w:proofErr w:type="spellStart"/>
       <w:r>
         <w:t>DBShrpn.dbo.emp_assignment</w:t>
       </w:r>
-    </w:p>
-    <w:p>
-      <w:pPr>
-        <w:spacing w:after="0"/>
-      </w:pPr>
+      <w:proofErr w:type="spellEnd"/>
+    </w:p>
+    <w:p>
+      <w:pPr>
+        <w:spacing w:after="0"/>
+      </w:pPr>
+      <w:proofErr w:type="spellStart"/>
       <w:r>
         <w:t>DBShrpn.dbo.emp_</w:t>
       </w:r>
       <w:r>
         <w:t>status</w:t>
       </w:r>
-    </w:p>
-    <w:p>
-      <w:pPr>
-        <w:spacing w:after="0"/>
-      </w:pPr>
+      <w:proofErr w:type="spellEnd"/>
+    </w:p>
+    <w:p>
+      <w:pPr>
+        <w:spacing w:after="0"/>
+      </w:pPr>
+      <w:proofErr w:type="spellStart"/>
       <w:r>
         <w:t>DBShrpn.dbo.pos_title</w:t>
       </w:r>
-    </w:p>
-    <w:p>
-      <w:pPr>
-        <w:spacing w:after="0"/>
-      </w:pPr>
+      <w:proofErr w:type="spellEnd"/>
+    </w:p>
+    <w:p>
+      <w:pPr>
+        <w:spacing w:after="0"/>
+      </w:pPr>
+      <w:proofErr w:type="spellStart"/>
       <w:r>
         <w:lastRenderedPageBreak/>
         <w:t>DBShrpn.dbo.job_title</w:t>
       </w:r>
+      <w:proofErr w:type="spellEnd"/>
     </w:p>
     <w:p>
       <w:pPr>
@@ -6490,65 +6544,84 @@
       <w:pPr>
         <w:spacing w:after="0"/>
       </w:pPr>
+      <w:proofErr w:type="spellStart"/>
       <w:r>
         <w:t>DBShrpn.dbo.employee</w:t>
       </w:r>
-    </w:p>
-    <w:p>
-      <w:pPr>
-        <w:spacing w:after="0"/>
-      </w:pPr>
+      <w:proofErr w:type="spellEnd"/>
+    </w:p>
+    <w:p>
+      <w:pPr>
+        <w:spacing w:after="0"/>
+      </w:pPr>
+      <w:proofErr w:type="spellStart"/>
       <w:r>
         <w:t>DBShrpn.dbo.individual</w:t>
       </w:r>
-    </w:p>
-    <w:p>
-      <w:pPr>
-        <w:spacing w:after="0"/>
-      </w:pPr>
-      <w:r>
-        <w:t xml:space="preserve">DBShrpn.dbo.individual_personal </w:t>
-      </w:r>
-    </w:p>
-    <w:p>
-      <w:pPr>
-        <w:spacing w:after="0"/>
-      </w:pPr>
+      <w:proofErr w:type="spellEnd"/>
+    </w:p>
+    <w:p>
+      <w:pPr>
+        <w:spacing w:after="0"/>
+      </w:pPr>
+      <w:proofErr w:type="spellStart"/>
+      <w:r>
+        <w:t>DBShrpn.dbo.individual_personal</w:t>
+      </w:r>
+      <w:proofErr w:type="spellEnd"/>
+      <w:r>
+        <w:t xml:space="preserve"> </w:t>
+      </w:r>
+    </w:p>
+    <w:p>
+      <w:pPr>
+        <w:spacing w:after="0"/>
+      </w:pPr>
+      <w:proofErr w:type="spellStart"/>
       <w:r>
         <w:t>DBShrpn.dbo.emp_employment</w:t>
       </w:r>
-    </w:p>
-    <w:p>
-      <w:pPr>
-        <w:spacing w:after="0"/>
-      </w:pPr>
+      <w:proofErr w:type="spellEnd"/>
+    </w:p>
+    <w:p>
+      <w:pPr>
+        <w:spacing w:after="0"/>
+      </w:pPr>
+      <w:proofErr w:type="spellStart"/>
       <w:r>
         <w:t>DBShrpn.dbo.emp_assignment</w:t>
       </w:r>
-    </w:p>
-    <w:p>
-      <w:pPr>
-        <w:spacing w:after="0"/>
-      </w:pPr>
+      <w:proofErr w:type="spellEnd"/>
+    </w:p>
+    <w:p>
+      <w:pPr>
+        <w:spacing w:after="0"/>
+      </w:pPr>
+      <w:proofErr w:type="spellStart"/>
       <w:r>
         <w:t>DBShrpn.dbo.emp_status</w:t>
       </w:r>
-    </w:p>
-    <w:p>
-      <w:pPr>
-        <w:spacing w:after="0"/>
-      </w:pPr>
+      <w:proofErr w:type="spellEnd"/>
+    </w:p>
+    <w:p>
+      <w:pPr>
+        <w:spacing w:after="0"/>
+      </w:pPr>
+      <w:proofErr w:type="spellStart"/>
       <w:r>
         <w:t>DBShrpn.dbo.emp_pay_element</w:t>
       </w:r>
-    </w:p>
-    <w:p>
-      <w:pPr>
-        <w:spacing w:after="0"/>
-      </w:pPr>
+      <w:proofErr w:type="spellEnd"/>
+    </w:p>
+    <w:p>
+      <w:pPr>
+        <w:spacing w:after="0"/>
+      </w:pPr>
+      <w:proofErr w:type="spellStart"/>
       <w:r>
         <w:t>DBShrpn.dbo.pay_element</w:t>
       </w:r>
+      <w:proofErr w:type="spellEnd"/>
     </w:p>
     <w:p>
       <w:pPr>
@@ -7074,9 +7147,11 @@
       <w:pPr>
         <w:spacing w:after="0"/>
       </w:pPr>
+      <w:proofErr w:type="spellStart"/>
       <w:r>
         <w:t>DBShrpn.dbo.ghr_employee_events</w:t>
       </w:r>
+      <w:proofErr w:type="spellEnd"/>
     </w:p>
     <w:p>
       <w:pPr>
@@ -7151,8 +7226,13 @@
             <w:hideMark/>
           </w:tcPr>
           <w:p>
-            <w:r>
-              <w:t xml:space="preserve">event_id                     </w:t>
+            <w:proofErr w:type="spellStart"/>
+            <w:r>
+              <w:t>event_id</w:t>
+            </w:r>
+            <w:proofErr w:type="spellEnd"/>
+            <w:r>
+              <w:t xml:space="preserve">                     </w:t>
             </w:r>
           </w:p>
         </w:tc>
@@ -7163,8 +7243,13 @@
             <w:hideMark/>
           </w:tcPr>
           <w:p>
-            <w:r>
-              <w:t xml:space="preserve">char(2)    </w:t>
+            <w:proofErr w:type="gramStart"/>
+            <w:r>
+              <w:t>char(</w:t>
+            </w:r>
+            <w:proofErr w:type="gramEnd"/>
+            <w:r>
+              <w:t xml:space="preserve">2)    </w:t>
             </w:r>
           </w:p>
         </w:tc>
@@ -7180,8 +7265,13 @@
             <w:hideMark/>
           </w:tcPr>
           <w:p>
-            <w:r>
-              <w:t xml:space="preserve">emp_id                       </w:t>
+            <w:proofErr w:type="spellStart"/>
+            <w:r>
+              <w:t>emp_id</w:t>
+            </w:r>
+            <w:proofErr w:type="spellEnd"/>
+            <w:r>
+              <w:t xml:space="preserve">                       </w:t>
             </w:r>
           </w:p>
         </w:tc>
@@ -7192,8 +7282,13 @@
             <w:hideMark/>
           </w:tcPr>
           <w:p>
-            <w:r>
-              <w:t xml:space="preserve">char(15)   </w:t>
+            <w:proofErr w:type="gramStart"/>
+            <w:r>
+              <w:t>char(</w:t>
+            </w:r>
+            <w:proofErr w:type="gramEnd"/>
+            <w:r>
+              <w:t xml:space="preserve">15)   </w:t>
             </w:r>
           </w:p>
         </w:tc>
@@ -7209,8 +7304,13 @@
             <w:hideMark/>
           </w:tcPr>
           <w:p>
-            <w:r>
-              <w:t xml:space="preserve">eff_date                     </w:t>
+            <w:proofErr w:type="spellStart"/>
+            <w:r>
+              <w:t>eff_date</w:t>
+            </w:r>
+            <w:proofErr w:type="spellEnd"/>
+            <w:r>
+              <w:t xml:space="preserve">                     </w:t>
             </w:r>
           </w:p>
         </w:tc>
@@ -7221,8 +7321,13 @@
             <w:hideMark/>
           </w:tcPr>
           <w:p>
-            <w:r>
-              <w:t xml:space="preserve">char(10)   </w:t>
+            <w:proofErr w:type="gramStart"/>
+            <w:r>
+              <w:t>char(</w:t>
+            </w:r>
+            <w:proofErr w:type="gramEnd"/>
+            <w:r>
+              <w:t xml:space="preserve">10)   </w:t>
             </w:r>
           </w:p>
         </w:tc>
@@ -7238,8 +7343,13 @@
             <w:hideMark/>
           </w:tcPr>
           <w:p>
-            <w:r>
-              <w:t xml:space="preserve">first_name                   </w:t>
+            <w:proofErr w:type="spellStart"/>
+            <w:r>
+              <w:t>first_name</w:t>
+            </w:r>
+            <w:proofErr w:type="spellEnd"/>
+            <w:r>
+              <w:t xml:space="preserve">                   </w:t>
             </w:r>
           </w:p>
         </w:tc>
@@ -7250,8 +7360,13 @@
             <w:hideMark/>
           </w:tcPr>
           <w:p>
-            <w:r>
-              <w:t xml:space="preserve">char(25)   </w:t>
+            <w:proofErr w:type="gramStart"/>
+            <w:r>
+              <w:t>char(</w:t>
+            </w:r>
+            <w:proofErr w:type="gramEnd"/>
+            <w:r>
+              <w:t xml:space="preserve">25)   </w:t>
             </w:r>
           </w:p>
         </w:tc>
@@ -7267,8 +7382,13 @@
             <w:hideMark/>
           </w:tcPr>
           <w:p>
-            <w:r>
-              <w:t xml:space="preserve">first_middle_name            </w:t>
+            <w:proofErr w:type="spellStart"/>
+            <w:r>
+              <w:t>first_middle_name</w:t>
+            </w:r>
+            <w:proofErr w:type="spellEnd"/>
+            <w:r>
+              <w:t xml:space="preserve">            </w:t>
             </w:r>
           </w:p>
         </w:tc>
@@ -7279,8 +7399,13 @@
             <w:hideMark/>
           </w:tcPr>
           <w:p>
-            <w:r>
-              <w:t xml:space="preserve">char(25)   </w:t>
+            <w:proofErr w:type="gramStart"/>
+            <w:r>
+              <w:t>char(</w:t>
+            </w:r>
+            <w:proofErr w:type="gramEnd"/>
+            <w:r>
+              <w:t xml:space="preserve">25)   </w:t>
             </w:r>
           </w:p>
         </w:tc>
@@ -7296,8 +7421,13 @@
             <w:hideMark/>
           </w:tcPr>
           <w:p>
-            <w:r>
-              <w:t xml:space="preserve">last_name                    </w:t>
+            <w:proofErr w:type="spellStart"/>
+            <w:r>
+              <w:t>last_name</w:t>
+            </w:r>
+            <w:proofErr w:type="spellEnd"/>
+            <w:r>
+              <w:t xml:space="preserve">                    </w:t>
             </w:r>
           </w:p>
         </w:tc>
@@ -7308,8 +7438,13 @@
             <w:hideMark/>
           </w:tcPr>
           <w:p>
-            <w:r>
-              <w:t xml:space="preserve">char(30)   </w:t>
+            <w:proofErr w:type="gramStart"/>
+            <w:r>
+              <w:t>char(</w:t>
+            </w:r>
+            <w:proofErr w:type="gramEnd"/>
+            <w:r>
+              <w:t xml:space="preserve">30)   </w:t>
             </w:r>
           </w:p>
         </w:tc>
@@ -7325,8 +7460,13 @@
             <w:hideMark/>
           </w:tcPr>
           <w:p>
-            <w:r>
-              <w:t xml:space="preserve">empl_id                      </w:t>
+            <w:proofErr w:type="spellStart"/>
+            <w:r>
+              <w:t>empl_id</w:t>
+            </w:r>
+            <w:proofErr w:type="spellEnd"/>
+            <w:r>
+              <w:t xml:space="preserve">                      </w:t>
             </w:r>
           </w:p>
         </w:tc>
@@ -7337,8 +7477,13 @@
             <w:hideMark/>
           </w:tcPr>
           <w:p>
-            <w:r>
-              <w:t xml:space="preserve">char(10)   </w:t>
+            <w:proofErr w:type="gramStart"/>
+            <w:r>
+              <w:t>char(</w:t>
+            </w:r>
+            <w:proofErr w:type="gramEnd"/>
+            <w:r>
+              <w:t xml:space="preserve">10)   </w:t>
             </w:r>
           </w:p>
         </w:tc>
@@ -7354,8 +7499,13 @@
             <w:hideMark/>
           </w:tcPr>
           <w:p>
-            <w:r>
-              <w:t xml:space="preserve">national_id_type_code        </w:t>
+            <w:proofErr w:type="spellStart"/>
+            <w:r>
+              <w:t>national_id_type_code</w:t>
+            </w:r>
+            <w:proofErr w:type="spellEnd"/>
+            <w:r>
+              <w:t xml:space="preserve">        </w:t>
             </w:r>
           </w:p>
         </w:tc>
@@ -7366,8 +7516,13 @@
             <w:hideMark/>
           </w:tcPr>
           <w:p>
-            <w:r>
-              <w:t xml:space="preserve">char(5)    </w:t>
+            <w:proofErr w:type="gramStart"/>
+            <w:r>
+              <w:t>char(</w:t>
+            </w:r>
+            <w:proofErr w:type="gramEnd"/>
+            <w:r>
+              <w:t xml:space="preserve">5)    </w:t>
             </w:r>
           </w:p>
         </w:tc>
@@ -7383,8 +7538,13 @@
             <w:hideMark/>
           </w:tcPr>
           <w:p>
-            <w:r>
-              <w:t xml:space="preserve">national_id                  </w:t>
+            <w:proofErr w:type="spellStart"/>
+            <w:r>
+              <w:t>national_id</w:t>
+            </w:r>
+            <w:proofErr w:type="spellEnd"/>
+            <w:r>
+              <w:t xml:space="preserve">                  </w:t>
             </w:r>
           </w:p>
         </w:tc>
@@ -7395,8 +7555,13 @@
             <w:hideMark/>
           </w:tcPr>
           <w:p>
-            <w:r>
-              <w:t xml:space="preserve">char(20)   </w:t>
+            <w:proofErr w:type="gramStart"/>
+            <w:r>
+              <w:t>char(</w:t>
+            </w:r>
+            <w:proofErr w:type="gramEnd"/>
+            <w:r>
+              <w:t xml:space="preserve">20)   </w:t>
             </w:r>
           </w:p>
         </w:tc>
@@ -7412,8 +7577,13 @@
             <w:hideMark/>
           </w:tcPr>
           <w:p>
-            <w:r>
-              <w:t xml:space="preserve">organization_group_id        </w:t>
+            <w:proofErr w:type="spellStart"/>
+            <w:r>
+              <w:t>organization_group_id</w:t>
+            </w:r>
+            <w:proofErr w:type="spellEnd"/>
+            <w:r>
+              <w:t xml:space="preserve">        </w:t>
             </w:r>
           </w:p>
         </w:tc>
@@ -7424,8 +7594,13 @@
             <w:hideMark/>
           </w:tcPr>
           <w:p>
-            <w:r>
-              <w:t xml:space="preserve">char(5)    </w:t>
+            <w:proofErr w:type="gramStart"/>
+            <w:r>
+              <w:t>char(</w:t>
+            </w:r>
+            <w:proofErr w:type="gramEnd"/>
+            <w:r>
+              <w:t xml:space="preserve">5)    </w:t>
             </w:r>
           </w:p>
         </w:tc>
@@ -7441,8 +7616,13 @@
             <w:hideMark/>
           </w:tcPr>
           <w:p>
-            <w:r>
-              <w:t xml:space="preserve">organization_chart_name      </w:t>
+            <w:proofErr w:type="spellStart"/>
+            <w:r>
+              <w:t>organization_chart_name</w:t>
+            </w:r>
+            <w:proofErr w:type="spellEnd"/>
+            <w:r>
+              <w:t xml:space="preserve">      </w:t>
             </w:r>
           </w:p>
         </w:tc>
@@ -7453,8 +7633,13 @@
             <w:hideMark/>
           </w:tcPr>
           <w:p>
-            <w:r>
-              <w:t xml:space="preserve">char(64)   </w:t>
+            <w:proofErr w:type="gramStart"/>
+            <w:r>
+              <w:t>char(</w:t>
+            </w:r>
+            <w:proofErr w:type="gramEnd"/>
+            <w:r>
+              <w:t xml:space="preserve">64)   </w:t>
             </w:r>
           </w:p>
         </w:tc>
@@ -7470,8 +7655,13 @@
             <w:hideMark/>
           </w:tcPr>
           <w:p>
-            <w:r>
-              <w:t xml:space="preserve">organization_unit_name       </w:t>
+            <w:proofErr w:type="spellStart"/>
+            <w:r>
+              <w:t>organization_unit_name</w:t>
+            </w:r>
+            <w:proofErr w:type="spellEnd"/>
+            <w:r>
+              <w:t xml:space="preserve">       </w:t>
             </w:r>
           </w:p>
         </w:tc>
@@ -7482,8 +7672,13 @@
             <w:hideMark/>
           </w:tcPr>
           <w:p>
-            <w:r>
-              <w:t xml:space="preserve">char(240)  </w:t>
+            <w:proofErr w:type="gramStart"/>
+            <w:r>
+              <w:t>char(</w:t>
+            </w:r>
+            <w:proofErr w:type="gramEnd"/>
+            <w:r>
+              <w:t xml:space="preserve">240)  </w:t>
             </w:r>
           </w:p>
         </w:tc>
@@ -7499,8 +7694,13 @@
             <w:hideMark/>
           </w:tcPr>
           <w:p>
-            <w:r>
-              <w:t xml:space="preserve">emp_status_classn_code       </w:t>
+            <w:proofErr w:type="spellStart"/>
+            <w:r>
+              <w:t>emp_status_classn_code</w:t>
+            </w:r>
+            <w:proofErr w:type="spellEnd"/>
+            <w:r>
+              <w:t xml:space="preserve">       </w:t>
             </w:r>
           </w:p>
         </w:tc>
@@ -7511,8 +7711,13 @@
             <w:hideMark/>
           </w:tcPr>
           <w:p>
-            <w:r>
-              <w:t xml:space="preserve">char(2)    </w:t>
+            <w:proofErr w:type="gramStart"/>
+            <w:r>
+              <w:t>char(</w:t>
+            </w:r>
+            <w:proofErr w:type="gramEnd"/>
+            <w:r>
+              <w:t xml:space="preserve">2)    </w:t>
             </w:r>
           </w:p>
         </w:tc>
@@ -7528,8 +7733,13 @@
             <w:hideMark/>
           </w:tcPr>
           <w:p>
-            <w:r>
-              <w:t xml:space="preserve">position_title               </w:t>
+            <w:proofErr w:type="spellStart"/>
+            <w:r>
+              <w:t>position_title</w:t>
+            </w:r>
+            <w:proofErr w:type="spellEnd"/>
+            <w:r>
+              <w:t xml:space="preserve">               </w:t>
             </w:r>
           </w:p>
         </w:tc>
@@ -7540,8 +7750,13 @@
             <w:hideMark/>
           </w:tcPr>
           <w:p>
-            <w:r>
-              <w:t xml:space="preserve">char(60)   </w:t>
+            <w:proofErr w:type="gramStart"/>
+            <w:r>
+              <w:t>char(</w:t>
+            </w:r>
+            <w:proofErr w:type="gramEnd"/>
+            <w:r>
+              <w:t xml:space="preserve">60)   </w:t>
             </w:r>
           </w:p>
         </w:tc>
@@ -7557,8 +7772,13 @@
             <w:hideMark/>
           </w:tcPr>
           <w:p>
-            <w:r>
-              <w:t xml:space="preserve">employment_type_code         </w:t>
+            <w:proofErr w:type="spellStart"/>
+            <w:r>
+              <w:t>employment_type_code</w:t>
+            </w:r>
+            <w:proofErr w:type="spellEnd"/>
+            <w:r>
+              <w:t xml:space="preserve">         </w:t>
             </w:r>
           </w:p>
         </w:tc>
@@ -7569,8 +7789,13 @@
             <w:hideMark/>
           </w:tcPr>
           <w:p>
-            <w:r>
-              <w:t>varchar(70)</w:t>
+            <w:proofErr w:type="gramStart"/>
+            <w:r>
+              <w:t>varchar(</w:t>
+            </w:r>
+            <w:proofErr w:type="gramEnd"/>
+            <w:r>
+              <w:t>70)</w:t>
             </w:r>
           </w:p>
         </w:tc>
@@ -7586,8 +7811,13 @@
             <w:hideMark/>
           </w:tcPr>
           <w:p>
-            <w:r>
-              <w:t xml:space="preserve">annual_salary_amt            </w:t>
+            <w:proofErr w:type="spellStart"/>
+            <w:r>
+              <w:t>annual_salary_amt</w:t>
+            </w:r>
+            <w:proofErr w:type="spellEnd"/>
+            <w:r>
+              <w:t xml:space="preserve">            </w:t>
             </w:r>
           </w:p>
         </w:tc>
@@ -7598,8 +7828,13 @@
             <w:hideMark/>
           </w:tcPr>
           <w:p>
-            <w:r>
-              <w:t xml:space="preserve">char(15)   </w:t>
+            <w:proofErr w:type="gramStart"/>
+            <w:r>
+              <w:t>char(</w:t>
+            </w:r>
+            <w:proofErr w:type="gramEnd"/>
+            <w:r>
+              <w:t xml:space="preserve">15)   </w:t>
             </w:r>
           </w:p>
         </w:tc>
@@ -7615,9 +7850,14 @@
             <w:hideMark/>
           </w:tcPr>
           <w:p>
+            <w:proofErr w:type="spellStart"/>
             <w:r>
               <w:lastRenderedPageBreak/>
-              <w:t xml:space="preserve">begin_date                   </w:t>
+              <w:t>begin_date</w:t>
+            </w:r>
+            <w:proofErr w:type="spellEnd"/>
+            <w:r>
+              <w:t xml:space="preserve">                   </w:t>
             </w:r>
           </w:p>
         </w:tc>
@@ -7628,8 +7868,13 @@
             <w:hideMark/>
           </w:tcPr>
           <w:p>
-            <w:r>
-              <w:t xml:space="preserve">char(10)   </w:t>
+            <w:proofErr w:type="gramStart"/>
+            <w:r>
+              <w:t>char(</w:t>
+            </w:r>
+            <w:proofErr w:type="gramEnd"/>
+            <w:r>
+              <w:t xml:space="preserve">10)   </w:t>
             </w:r>
           </w:p>
         </w:tc>
@@ -7645,8 +7890,13 @@
             <w:hideMark/>
           </w:tcPr>
           <w:p>
-            <w:r>
-              <w:t xml:space="preserve">end_date                     </w:t>
+            <w:proofErr w:type="spellStart"/>
+            <w:r>
+              <w:t>end_date</w:t>
+            </w:r>
+            <w:proofErr w:type="spellEnd"/>
+            <w:r>
+              <w:t xml:space="preserve">                     </w:t>
             </w:r>
           </w:p>
         </w:tc>
@@ -7657,8 +7907,13 @@
             <w:hideMark/>
           </w:tcPr>
           <w:p>
-            <w:r>
-              <w:t xml:space="preserve">char(10)   </w:t>
+            <w:proofErr w:type="gramStart"/>
+            <w:r>
+              <w:t>char(</w:t>
+            </w:r>
+            <w:proofErr w:type="gramEnd"/>
+            <w:r>
+              <w:t xml:space="preserve">10)   </w:t>
             </w:r>
           </w:p>
         </w:tc>
@@ -7674,8 +7929,13 @@
             <w:hideMark/>
           </w:tcPr>
           <w:p>
-            <w:r>
-              <w:t xml:space="preserve">pay_status_code              </w:t>
+            <w:proofErr w:type="spellStart"/>
+            <w:r>
+              <w:t>pay_status_code</w:t>
+            </w:r>
+            <w:proofErr w:type="spellEnd"/>
+            <w:r>
+              <w:t xml:space="preserve">              </w:t>
             </w:r>
           </w:p>
         </w:tc>
@@ -7686,8 +7946,13 @@
             <w:hideMark/>
           </w:tcPr>
           <w:p>
-            <w:r>
-              <w:t xml:space="preserve">char(1)    </w:t>
+            <w:proofErr w:type="gramStart"/>
+            <w:r>
+              <w:t>char(</w:t>
+            </w:r>
+            <w:proofErr w:type="gramEnd"/>
+            <w:r>
+              <w:t xml:space="preserve">1)    </w:t>
             </w:r>
           </w:p>
         </w:tc>
@@ -7703,8 +7968,13 @@
             <w:hideMark/>
           </w:tcPr>
           <w:p>
-            <w:r>
-              <w:t xml:space="preserve">pay_group_id                 </w:t>
+            <w:proofErr w:type="spellStart"/>
+            <w:r>
+              <w:t>pay_group_id</w:t>
+            </w:r>
+            <w:proofErr w:type="spellEnd"/>
+            <w:r>
+              <w:t xml:space="preserve">                 </w:t>
             </w:r>
           </w:p>
         </w:tc>
@@ -7715,8 +7985,13 @@
             <w:hideMark/>
           </w:tcPr>
           <w:p>
-            <w:r>
-              <w:t xml:space="preserve">char(10)   </w:t>
+            <w:proofErr w:type="gramStart"/>
+            <w:r>
+              <w:t>char(</w:t>
+            </w:r>
+            <w:proofErr w:type="gramEnd"/>
+            <w:r>
+              <w:t xml:space="preserve">10)   </w:t>
             </w:r>
           </w:p>
         </w:tc>
@@ -7732,8 +8007,13 @@
             <w:hideMark/>
           </w:tcPr>
           <w:p>
-            <w:r>
-              <w:t xml:space="preserve">pay_element_ctrl_grp_id      </w:t>
+            <w:proofErr w:type="spellStart"/>
+            <w:r>
+              <w:t>pay_element_ctrl_grp_id</w:t>
+            </w:r>
+            <w:proofErr w:type="spellEnd"/>
+            <w:r>
+              <w:t xml:space="preserve">      </w:t>
             </w:r>
           </w:p>
         </w:tc>
@@ -7744,8 +8024,13 @@
             <w:hideMark/>
           </w:tcPr>
           <w:p>
-            <w:r>
-              <w:t xml:space="preserve">char(10)   </w:t>
+            <w:proofErr w:type="gramStart"/>
+            <w:r>
+              <w:t>char(</w:t>
+            </w:r>
+            <w:proofErr w:type="gramEnd"/>
+            <w:r>
+              <w:t xml:space="preserve">10)   </w:t>
             </w:r>
           </w:p>
         </w:tc>
@@ -7761,8 +8046,13 @@
             <w:hideMark/>
           </w:tcPr>
           <w:p>
-            <w:r>
-              <w:t xml:space="preserve">time_reporting_meth_code     </w:t>
+            <w:proofErr w:type="spellStart"/>
+            <w:r>
+              <w:t>time_reporting_meth_code</w:t>
+            </w:r>
+            <w:proofErr w:type="spellEnd"/>
+            <w:r>
+              <w:t xml:space="preserve">     </w:t>
             </w:r>
           </w:p>
         </w:tc>
@@ -7773,8 +8063,13 @@
             <w:hideMark/>
           </w:tcPr>
           <w:p>
-            <w:r>
-              <w:t xml:space="preserve">char(1)    </w:t>
+            <w:proofErr w:type="gramStart"/>
+            <w:r>
+              <w:t>char(</w:t>
+            </w:r>
+            <w:proofErr w:type="gramEnd"/>
+            <w:r>
+              <w:t xml:space="preserve">1)    </w:t>
             </w:r>
           </w:p>
         </w:tc>
@@ -7790,9 +8085,11 @@
             <w:hideMark/>
           </w:tcPr>
           <w:p>
+            <w:proofErr w:type="spellStart"/>
             <w:r>
               <w:t>employment_info_chg_reason_cd</w:t>
             </w:r>
+            <w:proofErr w:type="spellEnd"/>
           </w:p>
         </w:tc>
         <w:tc>
@@ -7802,8 +8099,13 @@
             <w:hideMark/>
           </w:tcPr>
           <w:p>
-            <w:r>
-              <w:t xml:space="preserve">char(5)    </w:t>
+            <w:proofErr w:type="gramStart"/>
+            <w:r>
+              <w:t>char(</w:t>
+            </w:r>
+            <w:proofErr w:type="gramEnd"/>
+            <w:r>
+              <w:t xml:space="preserve">5)    </w:t>
             </w:r>
           </w:p>
         </w:tc>
@@ -7819,8 +8121,13 @@
             <w:hideMark/>
           </w:tcPr>
           <w:p>
-            <w:r>
-              <w:t xml:space="preserve">emp_location_code            </w:t>
+            <w:proofErr w:type="spellStart"/>
+            <w:r>
+              <w:t>emp_location_code</w:t>
+            </w:r>
+            <w:proofErr w:type="spellEnd"/>
+            <w:r>
+              <w:t xml:space="preserve">            </w:t>
             </w:r>
           </w:p>
         </w:tc>
@@ -7831,8 +8138,13 @@
             <w:hideMark/>
           </w:tcPr>
           <w:p>
-            <w:r>
-              <w:t xml:space="preserve">char(10)   </w:t>
+            <w:proofErr w:type="gramStart"/>
+            <w:r>
+              <w:t>char(</w:t>
+            </w:r>
+            <w:proofErr w:type="gramEnd"/>
+            <w:r>
+              <w:t xml:space="preserve">10)   </w:t>
             </w:r>
           </w:p>
         </w:tc>
@@ -7848,8 +8160,13 @@
             <w:hideMark/>
           </w:tcPr>
           <w:p>
-            <w:r>
-              <w:t xml:space="preserve">emp_status_code              </w:t>
+            <w:proofErr w:type="spellStart"/>
+            <w:r>
+              <w:t>emp_status_code</w:t>
+            </w:r>
+            <w:proofErr w:type="spellEnd"/>
+            <w:r>
+              <w:t xml:space="preserve">              </w:t>
             </w:r>
           </w:p>
         </w:tc>
@@ -7860,8 +8177,13 @@
             <w:hideMark/>
           </w:tcPr>
           <w:p>
-            <w:r>
-              <w:t xml:space="preserve">char(2)    </w:t>
+            <w:proofErr w:type="gramStart"/>
+            <w:r>
+              <w:t>char(</w:t>
+            </w:r>
+            <w:proofErr w:type="gramEnd"/>
+            <w:r>
+              <w:t xml:space="preserve">2)    </w:t>
             </w:r>
           </w:p>
         </w:tc>
@@ -7877,8 +8199,13 @@
             <w:hideMark/>
           </w:tcPr>
           <w:p>
-            <w:r>
-              <w:t xml:space="preserve">reason_code                  </w:t>
+            <w:proofErr w:type="spellStart"/>
+            <w:r>
+              <w:t>reason_code</w:t>
+            </w:r>
+            <w:proofErr w:type="spellEnd"/>
+            <w:r>
+              <w:t xml:space="preserve">                  </w:t>
             </w:r>
           </w:p>
         </w:tc>
@@ -7889,8 +8216,13 @@
             <w:hideMark/>
           </w:tcPr>
           <w:p>
-            <w:r>
-              <w:t xml:space="preserve">char(2)    </w:t>
+            <w:proofErr w:type="gramStart"/>
+            <w:r>
+              <w:t>char(</w:t>
+            </w:r>
+            <w:proofErr w:type="gramEnd"/>
+            <w:r>
+              <w:t xml:space="preserve">2)    </w:t>
             </w:r>
           </w:p>
         </w:tc>
@@ -7906,8 +8238,13 @@
             <w:hideMark/>
           </w:tcPr>
           <w:p>
-            <w:r>
-              <w:t xml:space="preserve">emp_expected_return_date     </w:t>
+            <w:proofErr w:type="spellStart"/>
+            <w:r>
+              <w:t>emp_expected_return_date</w:t>
+            </w:r>
+            <w:proofErr w:type="spellEnd"/>
+            <w:r>
+              <w:t xml:space="preserve">     </w:t>
             </w:r>
           </w:p>
         </w:tc>
@@ -7918,8 +8255,13 @@
             <w:hideMark/>
           </w:tcPr>
           <w:p>
-            <w:r>
-              <w:t xml:space="preserve">char(10)   </w:t>
+            <w:proofErr w:type="gramStart"/>
+            <w:r>
+              <w:t>char(</w:t>
+            </w:r>
+            <w:proofErr w:type="gramEnd"/>
+            <w:r>
+              <w:t xml:space="preserve">10)   </w:t>
             </w:r>
           </w:p>
         </w:tc>
@@ -7935,8 +8277,13 @@
             <w:hideMark/>
           </w:tcPr>
           <w:p>
-            <w:r>
-              <w:t xml:space="preserve">pay_through_date             </w:t>
+            <w:proofErr w:type="spellStart"/>
+            <w:r>
+              <w:t>pay_through_date</w:t>
+            </w:r>
+            <w:proofErr w:type="spellEnd"/>
+            <w:r>
+              <w:t xml:space="preserve">             </w:t>
             </w:r>
           </w:p>
         </w:tc>
@@ -7947,8 +8294,13 @@
             <w:hideMark/>
           </w:tcPr>
           <w:p>
-            <w:r>
-              <w:t xml:space="preserve">char(10)   </w:t>
+            <w:proofErr w:type="gramStart"/>
+            <w:r>
+              <w:t>char(</w:t>
+            </w:r>
+            <w:proofErr w:type="gramEnd"/>
+            <w:r>
+              <w:t xml:space="preserve">10)   </w:t>
             </w:r>
           </w:p>
         </w:tc>
@@ -7964,8 +8316,13 @@
             <w:hideMark/>
           </w:tcPr>
           <w:p>
-            <w:r>
-              <w:t xml:space="preserve">emp_death_date               </w:t>
+            <w:proofErr w:type="spellStart"/>
+            <w:r>
+              <w:t>emp_death_date</w:t>
+            </w:r>
+            <w:proofErr w:type="spellEnd"/>
+            <w:r>
+              <w:t xml:space="preserve">               </w:t>
             </w:r>
           </w:p>
         </w:tc>
@@ -7976,8 +8333,13 @@
             <w:hideMark/>
           </w:tcPr>
           <w:p>
-            <w:r>
-              <w:t xml:space="preserve">char(10)   </w:t>
+            <w:proofErr w:type="gramStart"/>
+            <w:r>
+              <w:t>char(</w:t>
+            </w:r>
+            <w:proofErr w:type="gramEnd"/>
+            <w:r>
+              <w:t xml:space="preserve">10)   </w:t>
             </w:r>
           </w:p>
         </w:tc>
@@ -7993,8 +8355,13 @@
             <w:hideMark/>
           </w:tcPr>
           <w:p>
-            <w:r>
-              <w:t xml:space="preserve">consider_for_rehire_ind      </w:t>
+            <w:proofErr w:type="spellStart"/>
+            <w:r>
+              <w:t>consider_for_rehire_ind</w:t>
+            </w:r>
+            <w:proofErr w:type="spellEnd"/>
+            <w:r>
+              <w:t xml:space="preserve">      </w:t>
             </w:r>
           </w:p>
         </w:tc>
@@ -8005,8 +8372,13 @@
             <w:hideMark/>
           </w:tcPr>
           <w:p>
-            <w:r>
-              <w:t xml:space="preserve">char(1)    </w:t>
+            <w:proofErr w:type="gramStart"/>
+            <w:r>
+              <w:t>char(</w:t>
+            </w:r>
+            <w:proofErr w:type="gramEnd"/>
+            <w:r>
+              <w:t xml:space="preserve">1)    </w:t>
             </w:r>
           </w:p>
         </w:tc>
@@ -8022,8 +8394,13 @@
             <w:hideMark/>
           </w:tcPr>
           <w:p>
-            <w:r>
-              <w:t xml:space="preserve">pay_element_id               </w:t>
+            <w:proofErr w:type="spellStart"/>
+            <w:r>
+              <w:t>pay_element_id</w:t>
+            </w:r>
+            <w:proofErr w:type="spellEnd"/>
+            <w:r>
+              <w:t xml:space="preserve">               </w:t>
             </w:r>
           </w:p>
         </w:tc>
@@ -8034,8 +8411,13 @@
             <w:hideMark/>
           </w:tcPr>
           <w:p>
-            <w:r>
-              <w:t xml:space="preserve">char(10)   </w:t>
+            <w:proofErr w:type="gramStart"/>
+            <w:r>
+              <w:t>char(</w:t>
+            </w:r>
+            <w:proofErr w:type="gramEnd"/>
+            <w:r>
+              <w:t xml:space="preserve">10)   </w:t>
             </w:r>
           </w:p>
         </w:tc>
@@ -8051,8 +8433,13 @@
             <w:hideMark/>
           </w:tcPr>
           <w:p>
-            <w:r>
-              <w:t xml:space="preserve">emp_calculation              </w:t>
+            <w:proofErr w:type="spellStart"/>
+            <w:r>
+              <w:t>emp_calculation</w:t>
+            </w:r>
+            <w:proofErr w:type="spellEnd"/>
+            <w:r>
+              <w:t xml:space="preserve">              </w:t>
             </w:r>
           </w:p>
         </w:tc>
@@ -8063,8 +8450,13 @@
             <w:hideMark/>
           </w:tcPr>
           <w:p>
-            <w:r>
-              <w:t xml:space="preserve">char(15)   </w:t>
+            <w:proofErr w:type="gramStart"/>
+            <w:r>
+              <w:t>char(</w:t>
+            </w:r>
+            <w:proofErr w:type="gramEnd"/>
+            <w:r>
+              <w:t xml:space="preserve">15)   </w:t>
             </w:r>
           </w:p>
         </w:tc>
@@ -8080,8 +8472,13 @@
             <w:hideMark/>
           </w:tcPr>
           <w:p>
-            <w:r>
-              <w:t xml:space="preserve">tax_flag                     </w:t>
+            <w:proofErr w:type="spellStart"/>
+            <w:r>
+              <w:t>tax_flag</w:t>
+            </w:r>
+            <w:proofErr w:type="spellEnd"/>
+            <w:r>
+              <w:t xml:space="preserve">                     </w:t>
             </w:r>
           </w:p>
         </w:tc>
@@ -8092,8 +8489,13 @@
             <w:hideMark/>
           </w:tcPr>
           <w:p>
-            <w:r>
-              <w:t xml:space="preserve">char(1)    </w:t>
+            <w:proofErr w:type="gramStart"/>
+            <w:r>
+              <w:t>char(</w:t>
+            </w:r>
+            <w:proofErr w:type="gramEnd"/>
+            <w:r>
+              <w:t xml:space="preserve">1)    </w:t>
             </w:r>
           </w:p>
         </w:tc>
@@ -8109,8 +8511,13 @@
             <w:hideMark/>
           </w:tcPr>
           <w:p>
-            <w:r>
-              <w:t xml:space="preserve">nic_flag                     </w:t>
+            <w:proofErr w:type="spellStart"/>
+            <w:r>
+              <w:t>nic_flag</w:t>
+            </w:r>
+            <w:proofErr w:type="spellEnd"/>
+            <w:r>
+              <w:t xml:space="preserve">                     </w:t>
             </w:r>
           </w:p>
         </w:tc>
@@ -8121,8 +8528,13 @@
             <w:hideMark/>
           </w:tcPr>
           <w:p>
-            <w:r>
-              <w:t xml:space="preserve">char(1)    </w:t>
+            <w:proofErr w:type="gramStart"/>
+            <w:r>
+              <w:t>char(</w:t>
+            </w:r>
+            <w:proofErr w:type="gramEnd"/>
+            <w:r>
+              <w:t xml:space="preserve">1)    </w:t>
             </w:r>
           </w:p>
         </w:tc>
@@ -8138,8 +8550,13 @@
             <w:hideMark/>
           </w:tcPr>
           <w:p>
-            <w:r>
-              <w:t xml:space="preserve">tax_ceiling_amt              </w:t>
+            <w:proofErr w:type="spellStart"/>
+            <w:r>
+              <w:t>tax_ceiling_amt</w:t>
+            </w:r>
+            <w:proofErr w:type="spellEnd"/>
+            <w:r>
+              <w:t xml:space="preserve">              </w:t>
             </w:r>
           </w:p>
         </w:tc>
@@ -8150,8 +8567,13 @@
             <w:hideMark/>
           </w:tcPr>
           <w:p>
-            <w:r>
-              <w:t xml:space="preserve">char(15)   </w:t>
+            <w:proofErr w:type="gramStart"/>
+            <w:r>
+              <w:t>char(</w:t>
+            </w:r>
+            <w:proofErr w:type="gramEnd"/>
+            <w:r>
+              <w:t xml:space="preserve">15)   </w:t>
             </w:r>
           </w:p>
         </w:tc>
@@ -8167,8 +8589,13 @@
             <w:hideMark/>
           </w:tcPr>
           <w:p>
-            <w:r>
-              <w:t xml:space="preserve">labor_grp_code               </w:t>
+            <w:proofErr w:type="spellStart"/>
+            <w:r>
+              <w:t>labor_grp_code</w:t>
+            </w:r>
+            <w:proofErr w:type="spellEnd"/>
+            <w:r>
+              <w:t xml:space="preserve">               </w:t>
             </w:r>
           </w:p>
         </w:tc>
@@ -8179,8 +8606,13 @@
             <w:hideMark/>
           </w:tcPr>
           <w:p>
-            <w:r>
-              <w:t xml:space="preserve">char(50)   </w:t>
+            <w:proofErr w:type="gramStart"/>
+            <w:r>
+              <w:t>char(</w:t>
+            </w:r>
+            <w:proofErr w:type="gramEnd"/>
+            <w:r>
+              <w:t xml:space="preserve">50)   </w:t>
             </w:r>
           </w:p>
         </w:tc>
@@ -8196,8 +8628,13 @@
             <w:hideMark/>
           </w:tcPr>
           <w:p>
-            <w:r>
-              <w:t xml:space="preserve">file_source                  </w:t>
+            <w:proofErr w:type="spellStart"/>
+            <w:r>
+              <w:t>file_source</w:t>
+            </w:r>
+            <w:proofErr w:type="spellEnd"/>
+            <w:r>
+              <w:t xml:space="preserve">                  </w:t>
             </w:r>
           </w:p>
         </w:tc>
@@ -8208,8 +8645,13 @@
             <w:hideMark/>
           </w:tcPr>
           <w:p>
-            <w:r>
-              <w:t xml:space="preserve">char(50)   </w:t>
+            <w:proofErr w:type="gramStart"/>
+            <w:r>
+              <w:t>char(</w:t>
+            </w:r>
+            <w:proofErr w:type="gramEnd"/>
+            <w:r>
+              <w:t xml:space="preserve">50)   </w:t>
             </w:r>
           </w:p>
         </w:tc>
@@ -8314,34 +8756,42 @@
       <w:pPr>
         <w:spacing w:after="0"/>
       </w:pPr>
+      <w:proofErr w:type="spellStart"/>
       <w:r>
         <w:t>DBSpscb.dbo.psc_step</w:t>
       </w:r>
-    </w:p>
-    <w:p>
-      <w:pPr>
-        <w:spacing w:after="0"/>
-      </w:pPr>
+      <w:proofErr w:type="spellEnd"/>
+    </w:p>
+    <w:p>
+      <w:pPr>
+        <w:spacing w:after="0"/>
+      </w:pPr>
+      <w:proofErr w:type="spellStart"/>
       <w:r>
         <w:t>DBSentp.dbo.batch_parameters</w:t>
       </w:r>
-    </w:p>
-    <w:p>
-      <w:pPr>
-        <w:spacing w:after="0"/>
-      </w:pPr>
+      <w:proofErr w:type="spellEnd"/>
+    </w:p>
+    <w:p>
+      <w:pPr>
+        <w:spacing w:after="0"/>
+      </w:pPr>
+      <w:proofErr w:type="spellStart"/>
       <w:r>
         <w:lastRenderedPageBreak/>
         <w:t>DBShrpn.dbo.ghr_employee_events_aud</w:t>
       </w:r>
-    </w:p>
-    <w:p>
-      <w:pPr>
-        <w:spacing w:after="0"/>
-      </w:pPr>
+      <w:proofErr w:type="spellEnd"/>
+    </w:p>
+    <w:p>
+      <w:pPr>
+        <w:spacing w:after="0"/>
+      </w:pPr>
+      <w:proofErr w:type="spellStart"/>
       <w:r>
         <w:t>DBShrpn.dbo.ghr_employee_events</w:t>
       </w:r>
+      <w:proofErr w:type="spellEnd"/>
     </w:p>
     <w:p>
       <w:pPr>
@@ -8366,9 +8816,11 @@
       <w:pPr>
         <w:spacing w:after="0"/>
       </w:pPr>
+      <w:proofErr w:type="spellStart"/>
       <w:r>
         <w:t>DBSCOMMON.dbo.message_master</w:t>
       </w:r>
+      <w:proofErr w:type="spellEnd"/>
     </w:p>
     <w:p>
       <w:pPr>
@@ -8434,9 +8886,11 @@
           <w:color w:val="FF0000"/>
         </w:rPr>
       </w:pPr>
+      <w:proofErr w:type="spellStart"/>
       <w:r>
         <w:t>DBShrpn.dbo.usp_ins_new_hire</w:t>
       </w:r>
+      <w:proofErr w:type="spellEnd"/>
       <w:r>
         <w:t xml:space="preserve"> </w:t>
       </w:r>
@@ -8485,9 +8939,11 @@
       <w:r>
         <w:tab/>
       </w:r>
+      <w:proofErr w:type="spellStart"/>
       <w:r>
         <w:t>DBShrpn.dbo.ghr_employee_events_aud</w:t>
       </w:r>
+      <w:proofErr w:type="spellEnd"/>
     </w:p>
     <w:p>
       <w:pPr>
@@ -8496,9 +8952,11 @@
       <w:r>
         <w:tab/>
       </w:r>
+      <w:proofErr w:type="spellStart"/>
       <w:r>
         <w:t>DBShrpn.dbo.ghr_historical_message</w:t>
       </w:r>
+      <w:proofErr w:type="spellEnd"/>
     </w:p>
     <w:p>
       <w:pPr>
@@ -8543,9 +9001,11 @@
       <w:r>
         <w:tab/>
       </w:r>
+      <w:proofErr w:type="spellStart"/>
       <w:r>
         <w:t>DBShrpn.dbo.usp_ins_hemp</w:t>
       </w:r>
+      <w:proofErr w:type="spellEnd"/>
     </w:p>
     <w:p>
       <w:pPr>
@@ -8589,6 +9049,7 @@
                 <w:bCs/>
               </w:rPr>
             </w:pPr>
+            <w:bookmarkStart w:id="29" w:name="_Hlk213950588"/>
             <w:r>
               <w:rPr>
                 <w:b/>
@@ -8829,7 +9290,23 @@
           </w:tcPr>
           <w:p>
             <w:r>
-              <w:t>Total nbr of employees that already exist: @1</w:t>
+              <w:t xml:space="preserve">Total </w:t>
+            </w:r>
+            <w:proofErr w:type="spellStart"/>
+            <w:r>
+              <w:t>nbr</w:t>
+            </w:r>
+            <w:proofErr w:type="spellEnd"/>
+            <w:r>
+              <w:t xml:space="preserve"> of employees that already </w:t>
+            </w:r>
+            <w:proofErr w:type="gramStart"/>
+            <w:r>
+              <w:t>exist:</w:t>
+            </w:r>
+            <w:proofErr w:type="gramEnd"/>
+            <w:r>
+              <w:t xml:space="preserve"> @1</w:t>
             </w:r>
           </w:p>
         </w:tc>
@@ -8901,7 +9378,15 @@
           </w:tcPr>
           <w:p>
             <w:r>
-              <w:t>NIS nbr is blank - defaulting 99999 for employee @1</w:t>
+              <w:t xml:space="preserve">NIS </w:t>
+            </w:r>
+            <w:proofErr w:type="spellStart"/>
+            <w:r>
+              <w:t>nbr</w:t>
+            </w:r>
+            <w:proofErr w:type="spellEnd"/>
+            <w:r>
+              <w:t xml:space="preserve"> is blank - defaulting 99999 for employee @1</w:t>
             </w:r>
           </w:p>
         </w:tc>
@@ -8939,7 +9424,39 @@
           </w:tcPr>
           <w:p>
             <w:r>
-              <w:t>This employee, @1,NIS nbr already exists - defaulting 99999. NIS nbr is: @2</w:t>
+              <w:t>This employee, @</w:t>
+            </w:r>
+            <w:proofErr w:type="gramStart"/>
+            <w:r>
+              <w:t>1,NIS</w:t>
+            </w:r>
+            <w:proofErr w:type="gramEnd"/>
+            <w:r>
+              <w:t xml:space="preserve"> </w:t>
+            </w:r>
+            <w:proofErr w:type="spellStart"/>
+            <w:r>
+              <w:t>nbr</w:t>
+            </w:r>
+            <w:proofErr w:type="spellEnd"/>
+            <w:r>
+              <w:t xml:space="preserve"> already exists - defaulting 99999. NIS </w:t>
+            </w:r>
+            <w:proofErr w:type="spellStart"/>
+            <w:r>
+              <w:t>nbr</w:t>
+            </w:r>
+            <w:proofErr w:type="spellEnd"/>
+            <w:r>
+              <w:t xml:space="preserve"> </w:t>
+            </w:r>
+            <w:proofErr w:type="gramStart"/>
+            <w:r>
+              <w:t>is:</w:t>
+            </w:r>
+            <w:proofErr w:type="gramEnd"/>
+            <w:r>
+              <w:t xml:space="preserve"> @2</w:t>
             </w:r>
           </w:p>
         </w:tc>
@@ -8979,7 +9496,15 @@
           </w:tcPr>
           <w:p>
             <w:r>
-              <w:t>NIS nbr was blank for employee, @1 - defaulting 99999</w:t>
+              <w:t xml:space="preserve">NIS </w:t>
+            </w:r>
+            <w:proofErr w:type="spellStart"/>
+            <w:r>
+              <w:t>nbr</w:t>
+            </w:r>
+            <w:proofErr w:type="spellEnd"/>
+            <w:r>
+              <w:t xml:space="preserve"> was blank for employee, @1 - defaulting 99999</w:t>
             </w:r>
           </w:p>
         </w:tc>
@@ -9084,7 +9609,15 @@
           </w:tcPr>
           <w:p>
             <w:r>
-              <w:t>Pay Group, @1, does not exists for employee, @2 - defaulting 99999</w:t>
+              <w:t xml:space="preserve">Pay Group, @1, does not </w:t>
+            </w:r>
+            <w:proofErr w:type="gramStart"/>
+            <w:r>
+              <w:t>exists</w:t>
+            </w:r>
+            <w:proofErr w:type="gramEnd"/>
+            <w:r>
+              <w:t xml:space="preserve"> for employee, @2 - defaulting 99999</w:t>
             </w:r>
           </w:p>
         </w:tc>
@@ -9119,7 +9652,15 @@
           </w:tcPr>
           <w:p>
             <w:r>
-              <w:t>Pay Element Control Group, @1 does not exists for employee,@2 -defaulting 99999</w:t>
+              <w:t xml:space="preserve">Pay Element Control Group, @1 does not exists for </w:t>
+            </w:r>
+            <w:proofErr w:type="gramStart"/>
+            <w:r>
+              <w:t>employee,@</w:t>
+            </w:r>
+            <w:proofErr w:type="gramEnd"/>
+            <w:r>
+              <w:t>2 -defaulting 99999</w:t>
             </w:r>
           </w:p>
         </w:tc>
@@ -9154,7 +9695,15 @@
           </w:tcPr>
           <w:p>
             <w:r>
-              <w:t>After April 1, 2023,Pay Group, @1, must be semi-monthly.</w:t>
+              <w:t xml:space="preserve">After April 1, </w:t>
+            </w:r>
+            <w:proofErr w:type="gramStart"/>
+            <w:r>
+              <w:t>2023,Pay</w:t>
+            </w:r>
+            <w:proofErr w:type="gramEnd"/>
+            <w:r>
+              <w:t xml:space="preserve"> Group, @1, must be semi-monthly.</w:t>
             </w:r>
           </w:p>
         </w:tc>
@@ -9272,6 +9821,7 @@
           </w:p>
         </w:tc>
       </w:tr>
+      <w:bookmarkEnd w:id="29"/>
     </w:tbl>
     <w:p>
       <w:pPr>
@@ -9282,11 +9832,11 @@
       <w:pPr>
         <w:pStyle w:val="Heading3"/>
       </w:pPr>
-      <w:bookmarkStart w:id="29" w:name="_Toc207985111"/>
+      <w:bookmarkStart w:id="30" w:name="_Toc207985111"/>
       <w:r>
         <w:t>Salary Change</w:t>
       </w:r>
-      <w:bookmarkEnd w:id="29"/>
+      <w:bookmarkEnd w:id="30"/>
     </w:p>
     <w:p>
       <w:pPr>
@@ -9334,9 +9884,11 @@
       <w:pPr>
         <w:spacing w:after="0"/>
       </w:pPr>
+      <w:proofErr w:type="spellStart"/>
       <w:r>
         <w:t>DBShrpn.dbo.usp_ins_salary_change</w:t>
       </w:r>
+      <w:proofErr w:type="spellEnd"/>
     </w:p>
     <w:p>
       <w:pPr>
@@ -9380,6 +9932,7 @@
                 <w:bCs/>
               </w:rPr>
             </w:pPr>
+            <w:bookmarkStart w:id="31" w:name="_Hlk213950693"/>
             <w:r>
               <w:rPr>
                 <w:b/>
@@ -9597,8 +10150,13 @@
           </w:tcPr>
           <w:p>
             <w:r>
-              <w:t>Employee, @1, does not exists</w:t>
-            </w:r>
+              <w:t xml:space="preserve">Employee, @1, does not </w:t>
+            </w:r>
+            <w:proofErr w:type="gramStart"/>
+            <w:r>
+              <w:t>exists</w:t>
+            </w:r>
+            <w:proofErr w:type="gramEnd"/>
           </w:p>
         </w:tc>
         <w:tc>
@@ -9632,7 +10190,15 @@
           </w:tcPr>
           <w:p>
             <w:r>
-              <w:t>Pay Group, @1, does not exists for employee, @2 - defaulting 99999</w:t>
+              <w:t xml:space="preserve">Pay Group, @1, does not </w:t>
+            </w:r>
+            <w:proofErr w:type="gramStart"/>
+            <w:r>
+              <w:t>exists</w:t>
+            </w:r>
+            <w:proofErr w:type="gramEnd"/>
+            <w:r>
+              <w:t xml:space="preserve"> for employee, @2 - defaulting 99999</w:t>
             </w:r>
           </w:p>
         </w:tc>
@@ -9667,7 +10233,15 @@
           </w:tcPr>
           <w:p>
             <w:r>
-              <w:t>The new effective date, @1 , for employee, @2, must be greater than the current effective date</w:t>
+              <w:t>The new effective date, @</w:t>
+            </w:r>
+            <w:proofErr w:type="gramStart"/>
+            <w:r>
+              <w:t>1 ,</w:t>
+            </w:r>
+            <w:proofErr w:type="gramEnd"/>
+            <w:r>
+              <w:t xml:space="preserve"> for employee, @2, must be greater than the current effective date</w:t>
             </w:r>
           </w:p>
         </w:tc>
@@ -9857,6 +10431,7 @@
           </w:p>
         </w:tc>
       </w:tr>
+      <w:bookmarkEnd w:id="31"/>
     </w:tbl>
     <w:p>
       <w:pPr>
@@ -9877,12 +10452,12 @@
       <w:pPr>
         <w:pStyle w:val="Heading3"/>
       </w:pPr>
-      <w:bookmarkStart w:id="30" w:name="_Toc207985112"/>
+      <w:bookmarkStart w:id="32" w:name="_Toc207985112"/>
       <w:r>
         <w:lastRenderedPageBreak/>
         <w:t>Transfer</w:t>
       </w:r>
-      <w:bookmarkEnd w:id="30"/>
+      <w:bookmarkEnd w:id="32"/>
     </w:p>
     <w:p>
       <w:pPr>
@@ -9897,9 +10472,11 @@
       <w:pPr>
         <w:spacing w:after="0"/>
       </w:pPr>
+      <w:proofErr w:type="spellStart"/>
       <w:r>
         <w:t>DBShrpn.dbo.usp_perform_transfer</w:t>
       </w:r>
+      <w:proofErr w:type="spellEnd"/>
     </w:p>
     <w:p>
       <w:pPr>
@@ -9965,6 +10542,7 @@
                 <w:bCs/>
               </w:rPr>
             </w:pPr>
+            <w:bookmarkStart w:id="33" w:name="_Hlk213950712"/>
             <w:r>
               <w:rPr>
                 <w:b/>
@@ -10185,8 +10763,13 @@
           </w:tcPr>
           <w:p>
             <w:r>
-              <w:t>Employee, @1, does not exists</w:t>
-            </w:r>
+              <w:t xml:space="preserve">Employee, @1, does not </w:t>
+            </w:r>
+            <w:proofErr w:type="gramStart"/>
+            <w:r>
+              <w:t>exists</w:t>
+            </w:r>
+            <w:proofErr w:type="gramEnd"/>
           </w:p>
         </w:tc>
         <w:tc>
@@ -10572,6 +11155,7 @@
           </w:p>
         </w:tc>
       </w:tr>
+      <w:bookmarkEnd w:id="33"/>
     </w:tbl>
     <w:p>
       <w:pPr>
@@ -10597,12 +11181,12 @@
       <w:pPr>
         <w:pStyle w:val="Heading3"/>
       </w:pPr>
-      <w:bookmarkStart w:id="31" w:name="_Toc207985113"/>
+      <w:bookmarkStart w:id="34" w:name="_Toc207985113"/>
       <w:r>
         <w:lastRenderedPageBreak/>
         <w:t>Name Change</w:t>
       </w:r>
-      <w:bookmarkEnd w:id="31"/>
+      <w:bookmarkEnd w:id="34"/>
     </w:p>
     <w:p>
       <w:pPr>
@@ -10617,9 +11201,11 @@
       <w:pPr>
         <w:spacing w:after="0"/>
       </w:pPr>
+      <w:proofErr w:type="spellStart"/>
       <w:r>
         <w:t>DBShrpn.dbo.usp_ins_name_change</w:t>
       </w:r>
+      <w:proofErr w:type="spellEnd"/>
     </w:p>
     <w:p>
       <w:pPr>
@@ -10663,6 +11249,7 @@
                 <w:bCs/>
               </w:rPr>
             </w:pPr>
+            <w:bookmarkStart w:id="35" w:name="_Hlk213950732"/>
             <w:r>
               <w:rPr>
                 <w:b/>
@@ -10902,8 +11489,13 @@
           </w:tcPr>
           <w:p>
             <w:r>
-              <w:t>Employee, @1, does not exists</w:t>
-            </w:r>
+              <w:t xml:space="preserve">Employee, @1, does not </w:t>
+            </w:r>
+            <w:proofErr w:type="gramStart"/>
+            <w:r>
+              <w:t>exists</w:t>
+            </w:r>
+            <w:proofErr w:type="gramEnd"/>
           </w:p>
         </w:tc>
         <w:tc>
@@ -11029,6 +11621,7 @@
           </w:p>
         </w:tc>
       </w:tr>
+      <w:bookmarkEnd w:id="35"/>
     </w:tbl>
     <w:p>
       <w:pPr>
@@ -11044,11 +11637,11 @@
       <w:pPr>
         <w:pStyle w:val="Heading3"/>
       </w:pPr>
-      <w:bookmarkStart w:id="32" w:name="_Toc207985114"/>
+      <w:bookmarkStart w:id="36" w:name="_Toc207985114"/>
       <w:r>
         <w:t>Status Change</w:t>
       </w:r>
-      <w:bookmarkEnd w:id="32"/>
+      <w:bookmarkEnd w:id="36"/>
     </w:p>
     <w:p>
       <w:pPr>
@@ -11063,9 +11656,11 @@
       <w:pPr>
         <w:spacing w:after="0"/>
       </w:pPr>
+      <w:proofErr w:type="spellStart"/>
       <w:r>
         <w:t>DBShrpn.dbo.usp_ins_status_change</w:t>
       </w:r>
+      <w:proofErr w:type="spellEnd"/>
     </w:p>
     <w:p>
       <w:pPr>
@@ -11074,9 +11669,11 @@
       <w:r>
         <w:tab/>
       </w:r>
+      <w:proofErr w:type="spellStart"/>
       <w:r>
         <w:t>DBShrpn.dbo.usp_upd_hmpl_rehire</w:t>
       </w:r>
+      <w:proofErr w:type="spellEnd"/>
     </w:p>
     <w:p>
       <w:pPr>
@@ -11085,9 +11682,11 @@
       <w:r>
         <w:tab/>
       </w:r>
+      <w:proofErr w:type="spellStart"/>
       <w:r>
         <w:t>DBShrpn.dbo.usp_ins_hpcg_hepy</w:t>
       </w:r>
+      <w:proofErr w:type="spellEnd"/>
     </w:p>
     <w:p>
       <w:pPr>
@@ -11096,9 +11695,11 @@
       <w:r>
         <w:tab/>
       </w:r>
+      <w:proofErr w:type="spellStart"/>
       <w:r>
         <w:t>DBShrpn.dbo.usp_upd_hmpl_inactivate</w:t>
       </w:r>
+      <w:proofErr w:type="spellEnd"/>
     </w:p>
     <w:p>
       <w:pPr>
@@ -11107,9 +11708,11 @@
       <w:r>
         <w:tab/>
       </w:r>
+      <w:proofErr w:type="spellStart"/>
       <w:r>
         <w:t>DBShrpn.dbo.usp_upd_hmpl_terminate</w:t>
       </w:r>
+      <w:proofErr w:type="spellEnd"/>
     </w:p>
     <w:p>
       <w:pPr>
@@ -11118,9 +11721,11 @@
       <w:r>
         <w:tab/>
       </w:r>
+      <w:proofErr w:type="spellStart"/>
       <w:r>
         <w:t>DBShrpn.dbo.usp_upd_hmpl_reactivate</w:t>
       </w:r>
+      <w:proofErr w:type="spellEnd"/>
     </w:p>
     <w:p>
       <w:pPr>
@@ -11164,6 +11769,7 @@
                 <w:bCs/>
               </w:rPr>
             </w:pPr>
+            <w:bookmarkStart w:id="37" w:name="_Hlk213950749"/>
             <w:r>
               <w:rPr>
                 <w:b/>
@@ -11415,8 +12021,13 @@
           </w:tcPr>
           <w:p>
             <w:r>
-              <w:t>Employee, @1, does not exists</w:t>
-            </w:r>
+              <w:t xml:space="preserve">Employee, @1, does not </w:t>
+            </w:r>
+            <w:proofErr w:type="gramStart"/>
+            <w:r>
+              <w:t>exists</w:t>
+            </w:r>
+            <w:proofErr w:type="gramEnd"/>
             <w:r>
               <w:t>.</w:t>
             </w:r>
@@ -11454,7 +12065,15 @@
           </w:tcPr>
           <w:p>
             <w:r>
-              <w:t>Cannot Inactivate an employee, @1, if the current status is not active.</w:t>
+              <w:t xml:space="preserve">Cannot Inactivate an employee, @1, if the </w:t>
+            </w:r>
+            <w:proofErr w:type="gramStart"/>
+            <w:r>
+              <w:t>current status</w:t>
+            </w:r>
+            <w:proofErr w:type="gramEnd"/>
+            <w:r>
+              <w:t xml:space="preserve"> is not active.</w:t>
             </w:r>
           </w:p>
         </w:tc>
@@ -11489,7 +12108,15 @@
           </w:tcPr>
           <w:p>
             <w:r>
-              <w:t>Cannot Reactivate an employee, @1, if the current status is not inactive.</w:t>
+              <w:t xml:space="preserve">Cannot Reactivate an employee, @1, if the </w:t>
+            </w:r>
+            <w:proofErr w:type="gramStart"/>
+            <w:r>
+              <w:t>current status</w:t>
+            </w:r>
+            <w:proofErr w:type="gramEnd"/>
+            <w:r>
+              <w:t xml:space="preserve"> is not inactive.</w:t>
             </w:r>
           </w:p>
         </w:tc>
@@ -11524,7 +12151,23 @@
           </w:tcPr>
           <w:p>
             <w:r>
-              <w:t>The current status is @1. To Reactivate an employee, @2, the current status must be inactive.</w:t>
+              <w:t xml:space="preserve">The </w:t>
+            </w:r>
+            <w:proofErr w:type="gramStart"/>
+            <w:r>
+              <w:t>current status</w:t>
+            </w:r>
+            <w:proofErr w:type="gramEnd"/>
+            <w:r>
+              <w:t xml:space="preserve"> is @1. To Reactivate an employee, @2, the </w:t>
+            </w:r>
+            <w:proofErr w:type="gramStart"/>
+            <w:r>
+              <w:t>current status</w:t>
+            </w:r>
+            <w:proofErr w:type="gramEnd"/>
+            <w:r>
+              <w:t xml:space="preserve"> must be inactive.</w:t>
             </w:r>
           </w:p>
         </w:tc>
@@ -11629,7 +12272,15 @@
           </w:tcPr>
           <w:p>
             <w:r>
-              <w:t>The current status is @1. Cannot rehire an employee, @2, without a current terminated status.</w:t>
+              <w:t xml:space="preserve">The </w:t>
+            </w:r>
+            <w:proofErr w:type="gramStart"/>
+            <w:r>
+              <w:t>current status</w:t>
+            </w:r>
+            <w:proofErr w:type="gramEnd"/>
+            <w:r>
+              <w:t xml:space="preserve"> is @1. Cannot rehire an employee, @2, without a current terminated status.</w:t>
             </w:r>
           </w:p>
         </w:tc>
@@ -11734,7 +12385,15 @@
           </w:tcPr>
           <w:p>
             <w:r>
-              <w:t>Cannot terminate employee, @1, if the current status is not active or inactive.</w:t>
+              <w:t xml:space="preserve">Cannot terminate employee, @1, if the </w:t>
+            </w:r>
+            <w:proofErr w:type="gramStart"/>
+            <w:r>
+              <w:t>current status</w:t>
+            </w:r>
+            <w:proofErr w:type="gramEnd"/>
+            <w:r>
+              <w:t xml:space="preserve"> is not active or inactive.</w:t>
             </w:r>
           </w:p>
         </w:tc>
@@ -11875,6 +12534,7 @@
           </w:p>
         </w:tc>
       </w:tr>
+      <w:bookmarkEnd w:id="37"/>
     </w:tbl>
     <w:p>
       <w:pPr>
@@ -11890,11 +12550,11 @@
       <w:pPr>
         <w:pStyle w:val="Heading3"/>
       </w:pPr>
-      <w:bookmarkStart w:id="33" w:name="_Toc207985115"/>
+      <w:bookmarkStart w:id="38" w:name="_Toc207985115"/>
       <w:r>
         <w:t>Pay Allowances</w:t>
       </w:r>
-      <w:bookmarkEnd w:id="33"/>
+      <w:bookmarkEnd w:id="38"/>
     </w:p>
     <w:p>
       <w:pPr>
@@ -11909,9 +12569,11 @@
       <w:pPr>
         <w:spacing w:after="0"/>
       </w:pPr>
+      <w:proofErr w:type="spellStart"/>
       <w:r>
         <w:t>DBShrpn.dbo.usp_ins_pay_element</w:t>
       </w:r>
+      <w:proofErr w:type="spellEnd"/>
     </w:p>
     <w:p>
       <w:pPr>
@@ -11920,9 +12582,11 @@
       <w:r>
         <w:tab/>
       </w:r>
+      <w:proofErr w:type="spellStart"/>
       <w:r>
         <w:t>DBShrpn.dbo.usp_ins_hepy_insert</w:t>
       </w:r>
+      <w:proofErr w:type="spellEnd"/>
     </w:p>
     <w:p>
       <w:pPr>
@@ -11966,6 +12630,7 @@
                 <w:bCs/>
               </w:rPr>
             </w:pPr>
+            <w:bookmarkStart w:id="39" w:name="_Hlk213950776"/>
             <w:r>
               <w:rPr>
                 <w:b/>
@@ -12170,7 +12835,15 @@
           </w:tcPr>
           <w:p>
             <w:r>
-              <w:t>Employee, @1, does not exists.</w:t>
+              <w:t xml:space="preserve">Employee, @1, does not </w:t>
+            </w:r>
+            <w:proofErr w:type="gramStart"/>
+            <w:r>
+              <w:t>exists</w:t>
+            </w:r>
+            <w:proofErr w:type="gramEnd"/>
+            <w:r>
+              <w:t>.</w:t>
             </w:r>
           </w:p>
           <w:p/>
@@ -12303,7 +12976,15 @@
           </w:tcPr>
           <w:p>
             <w:r>
-              <w:t>The stop date must be the same or later than the employee pay element effective date for employee, @1.</w:t>
+              <w:t xml:space="preserve">The stop date must be the same or later than the employee </w:t>
+            </w:r>
+            <w:proofErr w:type="gramStart"/>
+            <w:r>
+              <w:t>pay</w:t>
+            </w:r>
+            <w:proofErr w:type="gramEnd"/>
+            <w:r>
+              <w:t xml:space="preserve"> element effective date for employee, @1.</w:t>
             </w:r>
           </w:p>
           <w:p/>
@@ -12439,6 +13120,7 @@
           </w:p>
         </w:tc>
       </w:tr>
+      <w:bookmarkEnd w:id="39"/>
     </w:tbl>
     <w:p>
       <w:pPr>
@@ -12449,11 +13131,11 @@
       <w:pPr>
         <w:pStyle w:val="Heading3"/>
       </w:pPr>
-      <w:bookmarkStart w:id="34" w:name="_Toc207985116"/>
+      <w:bookmarkStart w:id="40" w:name="_Toc207985116"/>
       <w:r>
         <w:t>Update Pay Group</w:t>
       </w:r>
-      <w:bookmarkEnd w:id="34"/>
+      <w:bookmarkEnd w:id="40"/>
     </w:p>
     <w:p>
       <w:pPr>
@@ -12468,12 +13150,14 @@
       <w:pPr>
         <w:spacing w:after="0"/>
       </w:pPr>
+      <w:proofErr w:type="spellStart"/>
       <w:r>
         <w:t>DBShrpn.dbo.usp_ins_</w:t>
       </w:r>
       <w:r>
         <w:t>pay_group</w:t>
       </w:r>
+      <w:proofErr w:type="spellEnd"/>
     </w:p>
     <w:p>
       <w:pPr>
@@ -12513,6 +13197,7 @@
                 <w:bCs/>
               </w:rPr>
             </w:pPr>
+            <w:bookmarkStart w:id="41" w:name="_Hlk213950798"/>
             <w:r>
               <w:rPr>
                 <w:b/>
@@ -12700,7 +13385,15 @@
           </w:tcPr>
           <w:p>
             <w:r>
-              <w:t>Employee, @1, does not exists.</w:t>
+              <w:t xml:space="preserve">Employee, @1, does not </w:t>
+            </w:r>
+            <w:proofErr w:type="gramStart"/>
+            <w:r>
+              <w:t>exists</w:t>
+            </w:r>
+            <w:proofErr w:type="gramEnd"/>
+            <w:r>
+              <w:t>.</w:t>
             </w:r>
           </w:p>
           <w:p/>
@@ -12978,6 +13671,7 @@
           </w:p>
         </w:tc>
       </w:tr>
+      <w:bookmarkEnd w:id="41"/>
     </w:tbl>
     <w:p/>
     <w:p/>
@@ -12985,11 +13679,11 @@
       <w:pPr>
         <w:pStyle w:val="Heading3"/>
       </w:pPr>
-      <w:bookmarkStart w:id="35" w:name="_Toc207985117"/>
+      <w:bookmarkStart w:id="42" w:name="_Toc207985117"/>
       <w:r>
         <w:t>Update Labor Group</w:t>
       </w:r>
-      <w:bookmarkEnd w:id="35"/>
+      <w:bookmarkEnd w:id="42"/>
     </w:p>
     <w:p>
       <w:pPr>
@@ -13004,12 +13698,14 @@
       <w:pPr>
         <w:spacing w:after="0"/>
       </w:pPr>
+      <w:proofErr w:type="spellStart"/>
       <w:r>
         <w:t>DBShrpn.dbo.usp_ins_</w:t>
       </w:r>
       <w:r>
         <w:t>labor_group</w:t>
       </w:r>
+      <w:proofErr w:type="spellEnd"/>
     </w:p>
     <w:p>
       <w:pPr>
@@ -13049,6 +13745,7 @@
                 <w:bCs/>
               </w:rPr>
             </w:pPr>
+            <w:bookmarkStart w:id="43" w:name="_Hlk213950824"/>
             <w:r>
               <w:rPr>
                 <w:b/>
@@ -13239,7 +13936,15 @@
           </w:tcPr>
           <w:p>
             <w:r>
-              <w:t>Employee, @1, does not exists.</w:t>
+              <w:t xml:space="preserve">Employee, @1, does not </w:t>
+            </w:r>
+            <w:proofErr w:type="gramStart"/>
+            <w:r>
+              <w:t>exists</w:t>
+            </w:r>
+            <w:proofErr w:type="gramEnd"/>
+            <w:r>
+              <w:t>.</w:t>
             </w:r>
           </w:p>
         </w:tc>
@@ -13622,17 +14327,18 @@
           </w:p>
         </w:tc>
       </w:tr>
+      <w:bookmarkEnd w:id="43"/>
     </w:tbl>
     <w:p/>
     <w:p>
       <w:pPr>
         <w:pStyle w:val="Heading3"/>
       </w:pPr>
-      <w:bookmarkStart w:id="36" w:name="_Toc207985118"/>
+      <w:bookmarkStart w:id="44" w:name="_Toc207985118"/>
       <w:r>
         <w:t>Update Position Title</w:t>
       </w:r>
-      <w:bookmarkEnd w:id="36"/>
+      <w:bookmarkEnd w:id="44"/>
     </w:p>
     <w:p>
       <w:pPr>
@@ -13647,12 +14353,14 @@
       <w:pPr>
         <w:spacing w:after="0"/>
       </w:pPr>
+      <w:proofErr w:type="spellStart"/>
       <w:r>
         <w:t>DBShrpn.dbo.usp_ins_</w:t>
       </w:r>
       <w:r>
         <w:t>position_title</w:t>
       </w:r>
+      <w:proofErr w:type="spellEnd"/>
     </w:p>
     <w:p>
       <w:pPr>
@@ -13693,6 +14401,7 @@
                 <w:bCs/>
               </w:rPr>
             </w:pPr>
+            <w:bookmarkStart w:id="45" w:name="_Hlk213950848"/>
             <w:r>
               <w:rPr>
                 <w:b/>
@@ -13865,7 +14574,15 @@
           </w:tcPr>
           <w:p>
             <w:r>
-              <w:t>Employee, @1, does not exists.</w:t>
+              <w:t xml:space="preserve">Employee, @1, does not </w:t>
+            </w:r>
+            <w:proofErr w:type="gramStart"/>
+            <w:r>
+              <w:t>exists</w:t>
+            </w:r>
+            <w:proofErr w:type="gramEnd"/>
+            <w:r>
+              <w:t>.</w:t>
             </w:r>
           </w:p>
         </w:tc>
@@ -14166,6 +14883,7 @@
           </w:p>
         </w:tc>
       </w:tr>
+      <w:bookmarkEnd w:id="45"/>
     </w:tbl>
     <w:p/>
     <w:p>
@@ -14177,7 +14895,7 @@
       <w:pPr>
         <w:pStyle w:val="Heading2"/>
       </w:pPr>
-      <w:bookmarkStart w:id="37" w:name="_Toc207985120"/>
+      <w:bookmarkStart w:id="46" w:name="_Toc207985120"/>
       <w:r>
         <w:t xml:space="preserve">Step </w:t>
       </w:r>
@@ -14187,7 +14905,7 @@
       <w:r>
         <w:t xml:space="preserve"> – </w:t>
       </w:r>
-      <w:bookmarkEnd w:id="37"/>
+      <w:bookmarkEnd w:id="46"/>
       <w:r>
         <w:t>CSV</w:t>
       </w:r>
@@ -14367,17 +15085,21 @@
       <w:pPr>
         <w:spacing w:after="0"/>
       </w:pPr>
+      <w:proofErr w:type="spellStart"/>
       <w:r>
         <w:t>DBShrpn.dbo.ghr_employee_events_aud</w:t>
       </w:r>
-    </w:p>
-    <w:p>
-      <w:pPr>
-        <w:spacing w:after="0"/>
-      </w:pPr>
+      <w:proofErr w:type="spellEnd"/>
+    </w:p>
+    <w:p>
+      <w:pPr>
+        <w:spacing w:after="0"/>
+      </w:pPr>
+      <w:proofErr w:type="spellStart"/>
       <w:r>
         <w:t>DBShrpn.dbo.ghr_historical_message</w:t>
       </w:r>
+      <w:proofErr w:type="spellEnd"/>
     </w:p>
     <w:p>
       <w:pPr>
@@ -14388,25 +15110,34 @@
       <w:pPr>
         <w:pStyle w:val="Heading2"/>
       </w:pPr>
+      <w:bookmarkStart w:id="47" w:name="_Hlk213948783"/>
+      <w:r>
+        <w:t xml:space="preserve">Step </w:t>
+      </w:r>
+      <w:r>
+        <w:t>6</w:t>
+      </w:r>
+      <w:r>
+        <w:t xml:space="preserve"> –</w:t>
+      </w:r>
+      <w:r>
+        <w:t xml:space="preserve"> </w:t>
+      </w:r>
+      <w:r>
+        <w:t>SNDRPT</w:t>
+      </w:r>
+    </w:p>
+    <w:p>
+      <w:r>
+        <w:t>Alias Configuration</w:t>
+      </w:r>
+      <w:r>
+        <w:t xml:space="preserve"> REPORT</w:t>
+      </w:r>
+    </w:p>
+    <w:p>
       <w:r>
         <w:lastRenderedPageBreak/>
-        <w:t xml:space="preserve">Step </w:t>
-      </w:r>
-      <w:r>
-        <w:t>6</w:t>
-      </w:r>
-      <w:r>
-        <w:t xml:space="preserve"> – </w:t>
-      </w:r>
-      <w:r>
-        <w:t xml:space="preserve">Alias Configuration </w:t>
-      </w:r>
-      <w:r>
-        <w:t>SNDRPT</w:t>
-      </w:r>
-    </w:p>
-    <w:p>
-      <w:r>
         <w:drawing>
           <wp:inline distT="0" distB="0" distL="0" distR="0" wp14:anchorId="4061B67C" wp14:editId="13F8249C">
             <wp:extent cx="4032504" cy="1700784"/>
@@ -14444,6 +15175,7 @@
         </w:drawing>
       </w:r>
     </w:p>
+    <w:bookmarkEnd w:id="47"/>
     <w:p>
       <w:r>
         <w:t>SendReport.bat</w:t>
@@ -14493,12 +15225,12 @@
       <w:pPr>
         <w:pStyle w:val="Heading1"/>
       </w:pPr>
-      <w:bookmarkStart w:id="38" w:name="_Toc207985121"/>
+      <w:bookmarkStart w:id="48" w:name="_Toc207985121"/>
       <w:r>
         <w:lastRenderedPageBreak/>
         <w:t>GHR PAYSLIP_INTERFACE</w:t>
       </w:r>
-      <w:bookmarkEnd w:id="38"/>
+      <w:bookmarkEnd w:id="48"/>
     </w:p>
     <w:p>
       <w:pPr>
@@ -14554,11 +15286,11 @@
       <w:pPr>
         <w:pStyle w:val="Heading2"/>
       </w:pPr>
-      <w:bookmarkStart w:id="39" w:name="_Toc207985122"/>
+      <w:bookmarkStart w:id="49" w:name="_Toc207985122"/>
       <w:r>
         <w:t>Step 1 – EXT</w:t>
       </w:r>
-      <w:bookmarkEnd w:id="39"/>
+      <w:bookmarkEnd w:id="49"/>
     </w:p>
     <w:p>
       <w:pPr>
@@ -14630,65 +15362,81 @@
       <w:pPr>
         <w:spacing w:after="0"/>
       </w:pPr>
+      <w:proofErr w:type="spellStart"/>
       <w:r>
         <w:t>DBShrpy.dbo.emp_pmt</w:t>
       </w:r>
-    </w:p>
-    <w:p>
-      <w:pPr>
-        <w:spacing w:after="0"/>
-      </w:pPr>
+      <w:proofErr w:type="spellEnd"/>
+    </w:p>
+    <w:p>
+      <w:pPr>
+        <w:spacing w:after="0"/>
+      </w:pPr>
+      <w:proofErr w:type="spellStart"/>
       <w:r>
         <w:t>DBShrpy.dbo.ghr_payment_temp</w:t>
       </w:r>
-    </w:p>
-    <w:p>
-      <w:pPr>
-        <w:spacing w:after="0"/>
-      </w:pPr>
+      <w:proofErr w:type="spellEnd"/>
+    </w:p>
+    <w:p>
+      <w:pPr>
+        <w:spacing w:after="0"/>
+      </w:pPr>
+      <w:proofErr w:type="spellStart"/>
       <w:r>
         <w:t>DBShrpy.dbo.ghr_pay_period_temp</w:t>
       </w:r>
-    </w:p>
-    <w:p>
-      <w:pPr>
-        <w:spacing w:after="0"/>
-      </w:pPr>
+      <w:proofErr w:type="spellEnd"/>
+    </w:p>
+    <w:p>
+      <w:pPr>
+        <w:spacing w:after="0"/>
+      </w:pPr>
+      <w:proofErr w:type="spellStart"/>
       <w:r>
         <w:t>DBShrpy.dbo.ghr_emp_pmt_sum</w:t>
       </w:r>
-    </w:p>
-    <w:p>
-      <w:pPr>
-        <w:spacing w:after="0"/>
-      </w:pPr>
+      <w:proofErr w:type="spellEnd"/>
+    </w:p>
+    <w:p>
+      <w:pPr>
+        <w:spacing w:after="0"/>
+      </w:pPr>
+      <w:proofErr w:type="spellStart"/>
       <w:r>
         <w:t>DBShrpy.dbo.ghr_emp_pmt_pay_element_detail_sum</w:t>
       </w:r>
-    </w:p>
-    <w:p>
-      <w:pPr>
-        <w:spacing w:after="0"/>
-      </w:pPr>
+      <w:proofErr w:type="spellEnd"/>
+    </w:p>
+    <w:p>
+      <w:pPr>
+        <w:spacing w:after="0"/>
+      </w:pPr>
+      <w:proofErr w:type="spellStart"/>
       <w:r>
         <w:t>DBShrpy.dbo.ghr_emp_pmt_sum</w:t>
       </w:r>
-    </w:p>
-    <w:p>
-      <w:pPr>
-        <w:spacing w:after="0"/>
-      </w:pPr>
+      <w:proofErr w:type="spellEnd"/>
+    </w:p>
+    <w:p>
+      <w:pPr>
+        <w:spacing w:after="0"/>
+      </w:pPr>
+      <w:proofErr w:type="spellStart"/>
       <w:r>
         <w:t>DBShrpy.dbo.ghr_emp_pmt_ext</w:t>
       </w:r>
-    </w:p>
-    <w:p>
-      <w:pPr>
-        <w:spacing w:after="0"/>
-      </w:pPr>
+      <w:proofErr w:type="spellEnd"/>
+    </w:p>
+    <w:p>
+      <w:pPr>
+        <w:spacing w:after="0"/>
+      </w:pPr>
+      <w:proofErr w:type="spellStart"/>
       <w:r>
         <w:t>DBShrpy.dbo.ghr_emp_pmt_pay_element_detail_ext</w:t>
       </w:r>
+      <w:proofErr w:type="spellEnd"/>
     </w:p>
     <w:p>
       <w:pPr>
@@ -14708,11 +15456,13 @@
       <w:pPr>
         <w:spacing w:after="0"/>
       </w:pPr>
-      <w:bookmarkStart w:id="40" w:name="_Hlk199324204"/>
+      <w:bookmarkStart w:id="50" w:name="_Hlk199324204"/>
+      <w:proofErr w:type="spellStart"/>
       <w:r>
         <w:t>DBShrpy.dbo.usp_payslip_ext</w:t>
       </w:r>
-      <w:bookmarkEnd w:id="40"/>
+      <w:bookmarkEnd w:id="50"/>
+      <w:proofErr w:type="spellEnd"/>
     </w:p>
     <w:p>
       <w:pPr>
@@ -14751,11 +15501,11 @@
       <w:pPr>
         <w:pStyle w:val="Heading2"/>
       </w:pPr>
-      <w:bookmarkStart w:id="41" w:name="_Toc207985123"/>
+      <w:bookmarkStart w:id="51" w:name="_Toc207985123"/>
       <w:r>
         <w:t>Step 2 – NETPAY</w:t>
       </w:r>
-      <w:bookmarkEnd w:id="41"/>
+      <w:bookmarkEnd w:id="51"/>
     </w:p>
     <w:p>
       <w:pPr>
@@ -14843,25 +15593,31 @@
       <w:pPr>
         <w:spacing w:after="0"/>
       </w:pPr>
+      <w:proofErr w:type="spellStart"/>
       <w:r>
         <w:t>DBShrpn.dbo.ghr_emp_pmt_sumn_temp</w:t>
       </w:r>
-    </w:p>
-    <w:p>
-      <w:pPr>
-        <w:spacing w:after="0"/>
-      </w:pPr>
+      <w:proofErr w:type="spellEnd"/>
+    </w:p>
+    <w:p>
+      <w:pPr>
+        <w:spacing w:after="0"/>
+      </w:pPr>
+      <w:proofErr w:type="spellStart"/>
       <w:r>
         <w:t>DBSbank.dbo.pmt_ref_ctrl</w:t>
       </w:r>
-    </w:p>
-    <w:p>
-      <w:pPr>
-        <w:spacing w:after="0"/>
-      </w:pPr>
+      <w:proofErr w:type="spellEnd"/>
+    </w:p>
+    <w:p>
+      <w:pPr>
+        <w:spacing w:after="0"/>
+      </w:pPr>
+      <w:proofErr w:type="spellStart"/>
       <w:r>
         <w:t>DBShrpy.dbo.emp_pmt_disbursal_detail</w:t>
       </w:r>
+      <w:proofErr w:type="spellEnd"/>
     </w:p>
     <w:p>
       <w:pPr>
@@ -14877,12 +15633,12 @@
       <w:pPr>
         <w:pStyle w:val="Heading2"/>
       </w:pPr>
-      <w:bookmarkStart w:id="42" w:name="_Toc207985124"/>
+      <w:bookmarkStart w:id="52" w:name="_Toc207985124"/>
       <w:r>
         <w:lastRenderedPageBreak/>
         <w:t>Step 3 – EARN</w:t>
       </w:r>
-      <w:bookmarkEnd w:id="42"/>
+      <w:bookmarkEnd w:id="52"/>
     </w:p>
     <w:p>
       <w:pPr>
@@ -14957,25 +15713,31 @@
       <w:pPr>
         <w:spacing w:after="0"/>
       </w:pPr>
+      <w:proofErr w:type="spellStart"/>
       <w:r>
         <w:t>DBShrpn.dbo.ghr_earnings_temp</w:t>
       </w:r>
-    </w:p>
-    <w:p>
-      <w:pPr>
-        <w:spacing w:after="0"/>
-      </w:pPr>
+      <w:proofErr w:type="spellEnd"/>
+    </w:p>
+    <w:p>
+      <w:pPr>
+        <w:spacing w:after="0"/>
+      </w:pPr>
+      <w:proofErr w:type="spellStart"/>
       <w:r>
         <w:t>DBShrpy.dbo.ghr_emp_pmt_pay_element_detail_sum</w:t>
       </w:r>
-    </w:p>
-    <w:p>
-      <w:pPr>
-        <w:spacing w:after="0"/>
-      </w:pPr>
+      <w:proofErr w:type="spellEnd"/>
+    </w:p>
+    <w:p>
+      <w:pPr>
+        <w:spacing w:after="0"/>
+      </w:pPr>
+      <w:proofErr w:type="spellStart"/>
       <w:r>
         <w:t>DBShrpn.dbo.ghr_emp_pmt_sumn_temp</w:t>
       </w:r>
+      <w:proofErr w:type="spellEnd"/>
     </w:p>
     <w:p>
       <w:pPr>
@@ -14991,11 +15753,11 @@
       <w:pPr>
         <w:pStyle w:val="Heading2"/>
       </w:pPr>
-      <w:bookmarkStart w:id="43" w:name="_Toc207985125"/>
+      <w:bookmarkStart w:id="53" w:name="_Toc207985125"/>
       <w:r>
         <w:t>Step 4 – DEDUC</w:t>
       </w:r>
-      <w:bookmarkEnd w:id="43"/>
+      <w:bookmarkEnd w:id="53"/>
     </w:p>
     <w:p>
       <w:pPr>
@@ -15075,26 +15837,32 @@
       <w:pPr>
         <w:spacing w:after="0"/>
       </w:pPr>
+      <w:proofErr w:type="spellStart"/>
       <w:r>
         <w:lastRenderedPageBreak/>
         <w:t>DBShrpn.dbo.ghr_deduction_temp</w:t>
       </w:r>
-    </w:p>
-    <w:p>
-      <w:pPr>
-        <w:spacing w:after="0"/>
-      </w:pPr>
+      <w:proofErr w:type="spellEnd"/>
+    </w:p>
+    <w:p>
+      <w:pPr>
+        <w:spacing w:after="0"/>
+      </w:pPr>
+      <w:proofErr w:type="spellStart"/>
       <w:r>
         <w:t>DBShrpn.dbo.ghr_emp_pmt_sumn_temp</w:t>
       </w:r>
-    </w:p>
-    <w:p>
-      <w:pPr>
-        <w:spacing w:after="0"/>
-      </w:pPr>
+      <w:proofErr w:type="spellEnd"/>
+    </w:p>
+    <w:p>
+      <w:pPr>
+        <w:spacing w:after="0"/>
+      </w:pPr>
+      <w:proofErr w:type="spellStart"/>
       <w:r>
         <w:t>DBShrpy.dbo.ghr_emp_pmt_pay_element_detail_sum</w:t>
       </w:r>
+      <w:proofErr w:type="spellEnd"/>
     </w:p>
     <w:p>
       <w:pPr>
@@ -15118,12 +15886,12 @@
       <w:pPr>
         <w:pStyle w:val="Heading2"/>
       </w:pPr>
-      <w:bookmarkStart w:id="44" w:name="_Toc207985126"/>
+      <w:bookmarkStart w:id="54" w:name="_Toc207985126"/>
       <w:r>
         <w:lastRenderedPageBreak/>
         <w:t>Step 5 – EARNDUD</w:t>
       </w:r>
-      <w:bookmarkEnd w:id="44"/>
+      <w:bookmarkEnd w:id="54"/>
     </w:p>
     <w:p>
       <w:pPr>
@@ -15220,17 +15988,21 @@
       <w:pPr>
         <w:spacing w:after="0"/>
       </w:pPr>
+      <w:proofErr w:type="spellStart"/>
       <w:r>
         <w:t>DBShrpy.dbo.ghr_emp_pmt_pay_element_detail_sum</w:t>
       </w:r>
-    </w:p>
-    <w:p>
-      <w:pPr>
-        <w:spacing w:after="0"/>
-      </w:pPr>
+      <w:proofErr w:type="spellEnd"/>
+    </w:p>
+    <w:p>
+      <w:pPr>
+        <w:spacing w:after="0"/>
+      </w:pPr>
+      <w:proofErr w:type="spellStart"/>
       <w:r>
         <w:t>DBShrpn.dbo.ghr_emp_pmt_sumn_temp</w:t>
       </w:r>
+      <w:proofErr w:type="spellEnd"/>
     </w:p>
     <w:p>
       <w:pPr>
@@ -15241,11 +16013,11 @@
       <w:pPr>
         <w:pStyle w:val="Heading2"/>
       </w:pPr>
-      <w:bookmarkStart w:id="45" w:name="_Toc207985127"/>
+      <w:bookmarkStart w:id="55" w:name="_Toc207985127"/>
       <w:r>
         <w:t>Step 6 – SENDFILE</w:t>
       </w:r>
-      <w:bookmarkEnd w:id="45"/>
+      <w:bookmarkEnd w:id="55"/>
     </w:p>
     <w:p>
       <w:pPr>
@@ -15368,12 +16140,12 @@
       <w:pPr>
         <w:pStyle w:val="Heading1"/>
       </w:pPr>
-      <w:bookmarkStart w:id="46" w:name="_Toc207985128"/>
+      <w:bookmarkStart w:id="56" w:name="_Toc207985128"/>
       <w:r>
         <w:lastRenderedPageBreak/>
         <w:t>GHR RUN_EVENT</w:t>
       </w:r>
-      <w:bookmarkEnd w:id="46"/>
+      <w:bookmarkEnd w:id="56"/>
     </w:p>
     <w:p>
       <w:pPr>
@@ -15424,11 +16196,11 @@
       <w:pPr>
         <w:pStyle w:val="Heading2"/>
       </w:pPr>
-      <w:bookmarkStart w:id="47" w:name="_Toc207985129"/>
+      <w:bookmarkStart w:id="57" w:name="_Toc207985129"/>
       <w:r>
         <w:t>Step 1 – RUN</w:t>
       </w:r>
-      <w:bookmarkEnd w:id="47"/>
+      <w:bookmarkEnd w:id="57"/>
     </w:p>
     <w:p>
       <w:pPr>
@@ -15499,7 +16271,21 @@
         <w:rPr>
           <w:color w:val="FF0000"/>
         </w:rPr>
-        <w:t>Note: Procedure usp_event_main does not exist</w:t>
+        <w:t xml:space="preserve">Note: Procedure </w:t>
+      </w:r>
+      <w:proofErr w:type="spellStart"/>
+      <w:r>
+        <w:rPr>
+          <w:color w:val="FF0000"/>
+        </w:rPr>
+        <w:t>usp_event_main</w:t>
+      </w:r>
+      <w:proofErr w:type="spellEnd"/>
+      <w:r>
+        <w:rPr>
+          <w:color w:val="FF0000"/>
+        </w:rPr>
+        <w:t xml:space="preserve"> does not exist</w:t>
       </w:r>
       <w:r>
         <w:rPr>
@@ -15512,12 +16298,12 @@
       <w:pPr>
         <w:pStyle w:val="Heading1"/>
       </w:pPr>
-      <w:bookmarkStart w:id="48" w:name="_Toc207985130"/>
+      <w:bookmarkStart w:id="58" w:name="_Toc207985130"/>
       <w:r>
         <w:lastRenderedPageBreak/>
         <w:t>GHR SRV_TO_SRV_COPY</w:t>
       </w:r>
-      <w:bookmarkEnd w:id="48"/>
+      <w:bookmarkEnd w:id="58"/>
     </w:p>
     <w:p>
       <w:pPr>
@@ -15573,11 +16359,11 @@
       <w:pPr>
         <w:pStyle w:val="Heading2"/>
       </w:pPr>
-      <w:bookmarkStart w:id="49" w:name="_Toc207985131"/>
+      <w:bookmarkStart w:id="59" w:name="_Toc207985131"/>
       <w:r>
         <w:t>Step 1 – FTP</w:t>
       </w:r>
-      <w:bookmarkEnd w:id="49"/>
+      <w:bookmarkEnd w:id="59"/>
     </w:p>
     <w:p>
       <w:pPr>
@@ -15656,7 +16442,21 @@
         <w:rPr>
           <w:color w:val="FF0000"/>
         </w:rPr>
-        <w:t xml:space="preserve">Note: Procedure usp_event_main does not exist in </w:t>
+        <w:t xml:space="preserve">Note: Procedure </w:t>
+      </w:r>
+      <w:proofErr w:type="spellStart"/>
+      <w:r>
+        <w:rPr>
+          <w:color w:val="FF0000"/>
+        </w:rPr>
+        <w:t>usp_event_main</w:t>
+      </w:r>
+      <w:proofErr w:type="spellEnd"/>
+      <w:r>
+        <w:rPr>
+          <w:color w:val="FF0000"/>
+        </w:rPr>
+        <w:t xml:space="preserve"> does not exist in </w:t>
       </w:r>
       <w:r>
         <w:rPr>
@@ -15675,12 +16475,12 @@
       <w:pPr>
         <w:pStyle w:val="Heading1"/>
       </w:pPr>
-      <w:bookmarkStart w:id="50" w:name="_Toc207985132"/>
+      <w:bookmarkStart w:id="60" w:name="_Toc207985132"/>
       <w:r>
         <w:lastRenderedPageBreak/>
         <w:t>GHR VERIFICATION_0000</w:t>
       </w:r>
-      <w:bookmarkEnd w:id="50"/>
+      <w:bookmarkEnd w:id="60"/>
     </w:p>
     <w:p>
       <w:pPr>
@@ -15736,11 +16536,11 @@
       <w:pPr>
         <w:pStyle w:val="Heading2"/>
       </w:pPr>
-      <w:bookmarkStart w:id="51" w:name="_Toc207985133"/>
+      <w:bookmarkStart w:id="61" w:name="_Toc207985133"/>
       <w:r>
         <w:t>Step 1 – VER01</w:t>
       </w:r>
-      <w:bookmarkEnd w:id="51"/>
+      <w:bookmarkEnd w:id="61"/>
     </w:p>
     <w:p>
       <w:pPr>
@@ -15817,25 +16617,31 @@
       <w:pPr>
         <w:spacing w:after="0"/>
       </w:pPr>
+      <w:proofErr w:type="spellStart"/>
       <w:r>
         <w:t>DBShrpn.dbo.ghr_employee_events_aud</w:t>
       </w:r>
-    </w:p>
-    <w:p>
-      <w:pPr>
-        <w:spacing w:after="0"/>
-      </w:pPr>
+      <w:proofErr w:type="spellEnd"/>
+    </w:p>
+    <w:p>
+      <w:pPr>
+        <w:spacing w:after="0"/>
+      </w:pPr>
+      <w:proofErr w:type="spellStart"/>
       <w:r>
         <w:t>DBShrpn.dbo.ghr_email_report</w:t>
       </w:r>
-    </w:p>
-    <w:p>
-      <w:pPr>
-        <w:spacing w:after="0"/>
-      </w:pPr>
+      <w:proofErr w:type="spellEnd"/>
+    </w:p>
+    <w:p>
+      <w:pPr>
+        <w:spacing w:after="0"/>
+      </w:pPr>
+      <w:proofErr w:type="spellStart"/>
       <w:r>
         <w:t>DBShrpn.dbo.ghr_historical_message</w:t>
       </w:r>
+      <w:proofErr w:type="spellEnd"/>
     </w:p>
     <w:p>
       <w:pPr>
@@ -15964,8 +16770,13 @@
       <w:pStyle w:val="Heading1"/>
       <w:jc w:val="center"/>
     </w:pPr>
+    <w:proofErr w:type="spellStart"/>
     <w:r>
-      <w:t>SmartStream HCM Interfaces</w:t>
+      <w:t>SmartStream</w:t>
+    </w:r>
+    <w:proofErr w:type="spellEnd"/>
+    <w:r>
+      <w:t xml:space="preserve"> HCM Interfaces</w:t>
     </w:r>
   </w:p>
   <w:p>

</xml_diff>